<commit_message>
Les douze actions, numérotées de 1 à 12
</commit_message>
<xml_diff>
--- a/exemples/PROGRAMMES_PREVENTION_HARCELEMENT.docx
+++ b/exemples/PROGRAMMES_PREVENTION_HARCELEMENT.docx
@@ -29,7 +29,7 @@
           <w:color w:val="A0842E"/>
           <w:sz w:val="28"/>
         </w:rPr>
-        <w:t>Programmes de formation et d’information</w:t>
+        <w:t>Les douze actions, et le contenu détaillé de chacune</w:t>
       </w:r>
     </w:p>
     <w:p>
@@ -50,7 +50,7 @@
           <w:i w:val="0"/>
           <w:sz w:val="22"/>
         </w:rPr>
-        <w:t>Ce document contient les douze actions que l’employeur doit pouvoir prouver, et le contenu détaillé de chacune : ce qui est dit, pendant combien de temps, avec quel exercice, et ce qui est signé.</w:t>
+        <w:t>Ce document contient les douze actions que l’employeur doit pouvoir prouver, numérotées de 1 à 12, et le contenu détaillé de chacune : ce qui est fait, ce qui est dit, pendant combien de temps, avec quel exercice, et ce qui est signé. Les actions 7, 8 et 9 sont les trois programmes de formation et d’information ; elles sont développées module par module.</w:t>
       </w:r>
     </w:p>
     <w:p>
@@ -76,7 +76,7 @@
           <w:i w:val="0"/>
           <w:sz w:val="22"/>
         </w:rPr>
-        <w:t>Ce qui n’est pas prouvé n’a pas été fait. Chaque programme se termine donc par la liste des pièces qu’il produit, et par sa feuille d’émargement.</w:t>
+        <w:t>Ce qui n’est pas prouvé n’a pas été fait. Chaque action se termine donc par la liste des pièces qu’elle produit.</w:t>
       </w:r>
     </w:p>
     <w:p>
@@ -123,6 +123,844 @@
           <w:color w:val="1F3B57"/>
           <w:sz w:val="32"/>
         </w:rPr>
+        <w:t>Les douze actions</w:t>
+      </w:r>
+    </w:p>
+    <w:p>
+      <w:pPr>
+        <w:spacing w:after="160"/>
+        <w:pBdr>
+          <w:bottom w:val="single" w:sz="8" w:color="C9A84C"/>
+        </w:pBdr>
+      </w:pPr>
+    </w:p>
+    <w:p>
+      <w:pPr>
+        <w:spacing w:before="120" w:after="80"/>
+      </w:pPr>
+      <w:r>
+        <w:rPr>
+          <w:b w:val="0"/>
+          <w:i w:val="0"/>
+          <w:sz w:val="21"/>
+        </w:rPr>
+        <w:t>Ce tableau est la liste complète. Chaque ligne renvoie au chapitre du même numéro, où l’action est développée.</w:t>
+      </w:r>
+    </w:p>
+    <w:p>
+      <w:pPr>
+        <w:spacing w:before="0" w:after="200"/>
+      </w:pPr>
+      <w:r>
+        <w:rPr>
+          <w:b/>
+          <w:i w:val="0"/>
+          <w:sz w:val="21"/>
+        </w:rPr>
+        <w:t>La dernière colonne est celle qui compte : sans la pièce, l’action est réputée non faite.</w:t>
+      </w:r>
+    </w:p>
+    <w:tbl>
+      <w:tblPr>
+        <w:tblStyle w:val="TableGrid"/>
+        <w:tblW w:type="auto" w:w="0"/>
+        <w:tblLook w:firstColumn="1" w:firstRow="1" w:lastColumn="0" w:lastRow="0" w:noHBand="0" w:noVBand="1" w:val="04A0"/>
+      </w:tblPr>
+      <w:tblGrid>
+        <w:gridCol w:w="567"/>
+        <w:gridCol w:w="3628"/>
+        <w:gridCol w:w="2041"/>
+        <w:gridCol w:w="3118"/>
+      </w:tblGrid>
+      <w:tr>
+        <w:tc>
+          <w:tcPr>
+            <w:tcW w:type="dxa" w:w="2436"/>
+          </w:tcPr>
+          <w:p>
+            <w:r/>
+            <w:r>
+              <w:rPr>
+                <w:b/>
+                <w:sz w:val="19"/>
+              </w:rPr>
+              <w:t>N°</w:t>
+            </w:r>
+          </w:p>
+        </w:tc>
+        <w:tc>
+          <w:tcPr>
+            <w:tcW w:type="dxa" w:w="2436"/>
+          </w:tcPr>
+          <w:p>
+            <w:r/>
+            <w:r>
+              <w:rPr>
+                <w:b/>
+                <w:sz w:val="19"/>
+              </w:rPr>
+              <w:t>L’action</w:t>
+            </w:r>
+          </w:p>
+        </w:tc>
+        <w:tc>
+          <w:tcPr>
+            <w:tcW w:type="dxa" w:w="2436"/>
+          </w:tcPr>
+          <w:p>
+            <w:r/>
+            <w:r>
+              <w:rPr>
+                <w:b/>
+                <w:sz w:val="19"/>
+              </w:rPr>
+              <w:t>Article</w:t>
+            </w:r>
+          </w:p>
+        </w:tc>
+        <w:tc>
+          <w:tcPr>
+            <w:tcW w:type="dxa" w:w="2436"/>
+          </w:tcPr>
+          <w:p>
+            <w:r/>
+            <w:r>
+              <w:rPr>
+                <w:b/>
+                <w:sz w:val="19"/>
+              </w:rPr>
+              <w:t>La pièce qui la prouve</w:t>
+            </w:r>
+          </w:p>
+        </w:tc>
+      </w:tr>
+      <w:tr>
+        <w:tc>
+          <w:tcPr>
+            <w:tcW w:type="dxa" w:w="2436"/>
+          </w:tcPr>
+          <w:p>
+            <w:r>
+              <w:rPr>
+                <w:b/>
+                <w:color w:val="1F3B57"/>
+                <w:sz w:val="19"/>
+              </w:rPr>
+              <w:t>1</w:t>
+            </w:r>
+          </w:p>
+        </w:tc>
+        <w:tc>
+          <w:tcPr>
+            <w:tcW w:type="dxa" w:w="2436"/>
+          </w:tcPr>
+          <w:p>
+            <w:r>
+              <w:rPr>
+                <w:b/>
+                <w:sz w:val="19"/>
+              </w:rPr>
+              <w:t>Inscrire le risque au document unique</w:t>
+            </w:r>
+          </w:p>
+        </w:tc>
+        <w:tc>
+          <w:tcPr>
+            <w:tcW w:type="dxa" w:w="2436"/>
+          </w:tcPr>
+          <w:p>
+            <w:r>
+              <w:rPr>
+                <w:sz w:val="18"/>
+              </w:rPr>
+              <w:t>L.4121-3 et R.4121-1</w:t>
+            </w:r>
+          </w:p>
+        </w:tc>
+        <w:tc>
+          <w:tcPr>
+            <w:tcW w:type="dxa" w:w="2436"/>
+          </w:tcPr>
+          <w:p>
+            <w:r>
+              <w:rPr>
+                <w:color w:val="555555"/>
+                <w:sz w:val="18"/>
+              </w:rPr>
+              <w:t>Document unique daté, volet risques psychosociaux</w:t>
+            </w:r>
+          </w:p>
+        </w:tc>
+      </w:tr>
+      <w:tr>
+        <w:tc>
+          <w:tcPr>
+            <w:tcW w:type="dxa" w:w="2436"/>
+          </w:tcPr>
+          <w:p>
+            <w:r>
+              <w:rPr>
+                <w:b/>
+                <w:color w:val="1F3B57"/>
+                <w:sz w:val="19"/>
+              </w:rPr>
+              <w:t>2</w:t>
+            </w:r>
+          </w:p>
+        </w:tc>
+        <w:tc>
+          <w:tcPr>
+            <w:tcW w:type="dxa" w:w="2436"/>
+          </w:tcPr>
+          <w:p>
+            <w:r>
+              <w:rPr>
+                <w:b/>
+                <w:sz w:val="19"/>
+              </w:rPr>
+              <w:t>Afficher les textes et les voies de recours</w:t>
+            </w:r>
+          </w:p>
+        </w:tc>
+        <w:tc>
+          <w:tcPr>
+            <w:tcW w:type="dxa" w:w="2436"/>
+          </w:tcPr>
+          <w:p>
+            <w:r>
+              <w:rPr>
+                <w:sz w:val="18"/>
+              </w:rPr>
+              <w:t>L.1152-4 et L.1153-5</w:t>
+            </w:r>
+          </w:p>
+        </w:tc>
+        <w:tc>
+          <w:tcPr>
+            <w:tcW w:type="dxa" w:w="2436"/>
+          </w:tcPr>
+          <w:p>
+            <w:r>
+              <w:rPr>
+                <w:color w:val="555555"/>
+                <w:sz w:val="18"/>
+              </w:rPr>
+              <w:t>Photographies datées de l’affichage, par site</w:t>
+            </w:r>
+          </w:p>
+        </w:tc>
+      </w:tr>
+      <w:tr>
+        <w:tc>
+          <w:tcPr>
+            <w:tcW w:type="dxa" w:w="2436"/>
+          </w:tcPr>
+          <w:p>
+            <w:r>
+              <w:rPr>
+                <w:b/>
+                <w:color w:val="1F3B57"/>
+                <w:sz w:val="19"/>
+              </w:rPr>
+              <w:t>3</w:t>
+            </w:r>
+          </w:p>
+        </w:tc>
+        <w:tc>
+          <w:tcPr>
+            <w:tcW w:type="dxa" w:w="2436"/>
+          </w:tcPr>
+          <w:p>
+            <w:r>
+              <w:rPr>
+                <w:b/>
+                <w:sz w:val="19"/>
+              </w:rPr>
+              <w:t>Compléter le règlement intérieur</w:t>
+            </w:r>
+          </w:p>
+        </w:tc>
+        <w:tc>
+          <w:tcPr>
+            <w:tcW w:type="dxa" w:w="2436"/>
+          </w:tcPr>
+          <w:p>
+            <w:r>
+              <w:rPr>
+                <w:sz w:val="18"/>
+              </w:rPr>
+              <w:t>L.1321-2</w:t>
+            </w:r>
+          </w:p>
+        </w:tc>
+        <w:tc>
+          <w:tcPr>
+            <w:tcW w:type="dxa" w:w="2436"/>
+          </w:tcPr>
+          <w:p>
+            <w:r>
+              <w:rPr>
+                <w:color w:val="555555"/>
+                <w:sz w:val="18"/>
+              </w:rPr>
+              <w:t>Récépissé de dépôt au greffe</w:t>
+            </w:r>
+          </w:p>
+        </w:tc>
+      </w:tr>
+      <w:tr>
+        <w:tc>
+          <w:tcPr>
+            <w:tcW w:type="dxa" w:w="2436"/>
+          </w:tcPr>
+          <w:p>
+            <w:r>
+              <w:rPr>
+                <w:b/>
+                <w:color w:val="1F3B57"/>
+                <w:sz w:val="19"/>
+              </w:rPr>
+              <w:t>4</w:t>
+            </w:r>
+          </w:p>
+        </w:tc>
+        <w:tc>
+          <w:tcPr>
+            <w:tcW w:type="dxa" w:w="2436"/>
+          </w:tcPr>
+          <w:p>
+            <w:r>
+              <w:rPr>
+                <w:b/>
+                <w:sz w:val="19"/>
+              </w:rPr>
+              <w:t>Faire désigner le référent du comité</w:t>
+            </w:r>
+          </w:p>
+        </w:tc>
+        <w:tc>
+          <w:tcPr>
+            <w:tcW w:type="dxa" w:w="2436"/>
+          </w:tcPr>
+          <w:p>
+            <w:r>
+              <w:rPr>
+                <w:sz w:val="18"/>
+              </w:rPr>
+              <w:t>L.2314-1, dernier alinéa</w:t>
+            </w:r>
+          </w:p>
+        </w:tc>
+        <w:tc>
+          <w:tcPr>
+            <w:tcW w:type="dxa" w:w="2436"/>
+          </w:tcPr>
+          <w:p>
+            <w:r>
+              <w:rPr>
+                <w:color w:val="555555"/>
+                <w:sz w:val="18"/>
+              </w:rPr>
+              <w:t>Extrait du procès-verbal de désignation</w:t>
+            </w:r>
+          </w:p>
+        </w:tc>
+      </w:tr>
+      <w:tr>
+        <w:tc>
+          <w:tcPr>
+            <w:tcW w:type="dxa" w:w="2436"/>
+          </w:tcPr>
+          <w:p>
+            <w:r>
+              <w:rPr>
+                <w:b/>
+                <w:color w:val="1F3B57"/>
+                <w:sz w:val="19"/>
+              </w:rPr>
+              <w:t>5</w:t>
+            </w:r>
+          </w:p>
+        </w:tc>
+        <w:tc>
+          <w:tcPr>
+            <w:tcW w:type="dxa" w:w="2436"/>
+          </w:tcPr>
+          <w:p>
+            <w:r>
+              <w:rPr>
+                <w:b/>
+                <w:sz w:val="19"/>
+              </w:rPr>
+              <w:t>Désigner le référent de l’employeur (≥ 250 salariés)</w:t>
+            </w:r>
+          </w:p>
+        </w:tc>
+        <w:tc>
+          <w:tcPr>
+            <w:tcW w:type="dxa" w:w="2436"/>
+          </w:tcPr>
+          <w:p>
+            <w:r>
+              <w:rPr>
+                <w:sz w:val="18"/>
+              </w:rPr>
+              <w:t>L.1153-5-1</w:t>
+            </w:r>
+          </w:p>
+        </w:tc>
+        <w:tc>
+          <w:tcPr>
+            <w:tcW w:type="dxa" w:w="2436"/>
+          </w:tcPr>
+          <w:p>
+            <w:r>
+              <w:rPr>
+                <w:color w:val="555555"/>
+                <w:sz w:val="18"/>
+              </w:rPr>
+              <w:t>Note de désignation et lettre de mission</w:t>
+            </w:r>
+          </w:p>
+        </w:tc>
+      </w:tr>
+      <w:tr>
+        <w:tc>
+          <w:tcPr>
+            <w:tcW w:type="dxa" w:w="2436"/>
+          </w:tcPr>
+          <w:p>
+            <w:r>
+              <w:rPr>
+                <w:b/>
+                <w:color w:val="1F3B57"/>
+                <w:sz w:val="19"/>
+              </w:rPr>
+              <w:t>6</w:t>
+            </w:r>
+          </w:p>
+        </w:tc>
+        <w:tc>
+          <w:tcPr>
+            <w:tcW w:type="dxa" w:w="2436"/>
+          </w:tcPr>
+          <w:p>
+            <w:r>
+              <w:rPr>
+                <w:b/>
+                <w:sz w:val="19"/>
+              </w:rPr>
+              <w:t>Écrire et diffuser la procédure de signalement</w:t>
+            </w:r>
+          </w:p>
+        </w:tc>
+        <w:tc>
+          <w:tcPr>
+            <w:tcW w:type="dxa" w:w="2436"/>
+          </w:tcPr>
+          <w:p>
+            <w:r>
+              <w:rPr>
+                <w:sz w:val="18"/>
+              </w:rPr>
+              <w:t>L.1152-2, L.1152-4, L.4121-1 (3°)</w:t>
+            </w:r>
+          </w:p>
+        </w:tc>
+        <w:tc>
+          <w:tcPr>
+            <w:tcW w:type="dxa" w:w="2436"/>
+          </w:tcPr>
+          <w:p>
+            <w:r>
+              <w:rPr>
+                <w:color w:val="555555"/>
+                <w:sz w:val="18"/>
+              </w:rPr>
+              <w:t>Preuve de diffusion horodatée</w:t>
+            </w:r>
+          </w:p>
+        </w:tc>
+      </w:tr>
+      <w:tr>
+        <w:tc>
+          <w:tcPr>
+            <w:tcW w:type="dxa" w:w="2436"/>
+          </w:tcPr>
+          <w:p>
+            <w:r>
+              <w:rPr>
+                <w:b/>
+                <w:color w:val="1F3B57"/>
+                <w:sz w:val="19"/>
+              </w:rPr>
+              <w:t>7</w:t>
+            </w:r>
+          </w:p>
+        </w:tc>
+        <w:tc>
+          <w:tcPr>
+            <w:tcW w:type="dxa" w:w="2436"/>
+          </w:tcPr>
+          <w:p>
+            <w:r>
+              <w:rPr>
+                <w:b/>
+                <w:sz w:val="19"/>
+              </w:rPr>
+              <w:t>Former les dirigeants et l’encadrement — programme, 7 h</w:t>
+            </w:r>
+          </w:p>
+        </w:tc>
+        <w:tc>
+          <w:tcPr>
+            <w:tcW w:type="dxa" w:w="2436"/>
+          </w:tcPr>
+          <w:p>
+            <w:r>
+              <w:rPr>
+                <w:sz w:val="18"/>
+              </w:rPr>
+              <w:t>L.4121-1 (2°)</w:t>
+            </w:r>
+          </w:p>
+        </w:tc>
+        <w:tc>
+          <w:tcPr>
+            <w:tcW w:type="dxa" w:w="2436"/>
+          </w:tcPr>
+          <w:p>
+            <w:r>
+              <w:rPr>
+                <w:color w:val="555555"/>
+                <w:sz w:val="18"/>
+              </w:rPr>
+              <w:t>Feuille d’émargement et questionnaire corrigé</w:t>
+            </w:r>
+          </w:p>
+        </w:tc>
+      </w:tr>
+      <w:tr>
+        <w:tc>
+          <w:tcPr>
+            <w:tcW w:type="dxa" w:w="2436"/>
+          </w:tcPr>
+          <w:p>
+            <w:r>
+              <w:rPr>
+                <w:b/>
+                <w:color w:val="1F3B57"/>
+                <w:sz w:val="19"/>
+              </w:rPr>
+              <w:t>8</w:t>
+            </w:r>
+          </w:p>
+        </w:tc>
+        <w:tc>
+          <w:tcPr>
+            <w:tcW w:type="dxa" w:w="2436"/>
+          </w:tcPr>
+          <w:p>
+            <w:r>
+              <w:rPr>
+                <w:b/>
+                <w:sz w:val="19"/>
+              </w:rPr>
+              <w:t>Former les référents — programme, 14 h</w:t>
+            </w:r>
+          </w:p>
+        </w:tc>
+        <w:tc>
+          <w:tcPr>
+            <w:tcW w:type="dxa" w:w="2436"/>
+          </w:tcPr>
+          <w:p>
+            <w:r>
+              <w:rPr>
+                <w:sz w:val="18"/>
+              </w:rPr>
+              <w:t>L.2315-18 et L.4121-1 (2°)</w:t>
+            </w:r>
+          </w:p>
+        </w:tc>
+        <w:tc>
+          <w:tcPr>
+            <w:tcW w:type="dxa" w:w="2436"/>
+          </w:tcPr>
+          <w:p>
+            <w:r>
+              <w:rPr>
+                <w:color w:val="555555"/>
+                <w:sz w:val="18"/>
+              </w:rPr>
+              <w:t>Attestation individuelle de formation</w:t>
+            </w:r>
+          </w:p>
+        </w:tc>
+      </w:tr>
+      <w:tr>
+        <w:tc>
+          <w:tcPr>
+            <w:tcW w:type="dxa" w:w="2436"/>
+          </w:tcPr>
+          <w:p>
+            <w:r>
+              <w:rPr>
+                <w:b/>
+                <w:color w:val="1F3B57"/>
+                <w:sz w:val="19"/>
+              </w:rPr>
+              <w:t>9</w:t>
+            </w:r>
+          </w:p>
+        </w:tc>
+        <w:tc>
+          <w:tcPr>
+            <w:tcW w:type="dxa" w:w="2436"/>
+          </w:tcPr>
+          <w:p>
+            <w:r>
+              <w:rPr>
+                <w:b/>
+                <w:sz w:val="19"/>
+              </w:rPr>
+              <w:t>Informer l’ensemble des salariés — programme, 1 h 30</w:t>
+            </w:r>
+          </w:p>
+        </w:tc>
+        <w:tc>
+          <w:tcPr>
+            <w:tcW w:type="dxa" w:w="2436"/>
+          </w:tcPr>
+          <w:p>
+            <w:r>
+              <w:rPr>
+                <w:sz w:val="18"/>
+              </w:rPr>
+              <w:t>L.4121-1 (2°)</w:t>
+            </w:r>
+          </w:p>
+        </w:tc>
+        <w:tc>
+          <w:tcPr>
+            <w:tcW w:type="dxa" w:w="2436"/>
+          </w:tcPr>
+          <w:p>
+            <w:r>
+              <w:rPr>
+                <w:color w:val="555555"/>
+                <w:sz w:val="18"/>
+              </w:rPr>
+              <w:t>Émargement ou accusé de lecture horodaté</w:t>
+            </w:r>
+          </w:p>
+        </w:tc>
+      </w:tr>
+      <w:tr>
+        <w:tc>
+          <w:tcPr>
+            <w:tcW w:type="dxa" w:w="2436"/>
+          </w:tcPr>
+          <w:p>
+            <w:r>
+              <w:rPr>
+                <w:b/>
+                <w:color w:val="1F3B57"/>
+                <w:sz w:val="19"/>
+              </w:rPr>
+              <w:t>10</w:t>
+            </w:r>
+          </w:p>
+        </w:tc>
+        <w:tc>
+          <w:tcPr>
+            <w:tcW w:type="dxa" w:w="2436"/>
+          </w:tcPr>
+          <w:p>
+            <w:r>
+              <w:rPr>
+                <w:b/>
+                <w:sz w:val="19"/>
+              </w:rPr>
+              <w:t>Informer à l’embauche</w:t>
+            </w:r>
+          </w:p>
+        </w:tc>
+        <w:tc>
+          <w:tcPr>
+            <w:tcW w:type="dxa" w:w="2436"/>
+          </w:tcPr>
+          <w:p>
+            <w:r>
+              <w:rPr>
+                <w:sz w:val="18"/>
+              </w:rPr>
+              <w:t>L.4121-1 (2°)</w:t>
+            </w:r>
+          </w:p>
+        </w:tc>
+        <w:tc>
+          <w:tcPr>
+            <w:tcW w:type="dxa" w:w="2436"/>
+          </w:tcPr>
+          <w:p>
+            <w:r>
+              <w:rPr>
+                <w:color w:val="555555"/>
+                <w:sz w:val="18"/>
+              </w:rPr>
+              <w:t>Notice émargée, et contrôle mensuel des entrants</w:t>
+            </w:r>
+          </w:p>
+        </w:tc>
+      </w:tr>
+      <w:tr>
+        <w:tc>
+          <w:tcPr>
+            <w:tcW w:type="dxa" w:w="2436"/>
+          </w:tcPr>
+          <w:p>
+            <w:r>
+              <w:rPr>
+                <w:b/>
+                <w:color w:val="1F3B57"/>
+                <w:sz w:val="19"/>
+              </w:rPr>
+              <w:t>11</w:t>
+            </w:r>
+          </w:p>
+        </w:tc>
+        <w:tc>
+          <w:tcPr>
+            <w:tcW w:type="dxa" w:w="2436"/>
+          </w:tcPr>
+          <w:p>
+            <w:r>
+              <w:rPr>
+                <w:b/>
+                <w:sz w:val="19"/>
+              </w:rPr>
+              <w:t>Tenir le registre des signalements</w:t>
+            </w:r>
+          </w:p>
+        </w:tc>
+        <w:tc>
+          <w:tcPr>
+            <w:tcW w:type="dxa" w:w="2436"/>
+          </w:tcPr>
+          <w:p>
+            <w:r>
+              <w:rPr>
+                <w:sz w:val="18"/>
+              </w:rPr>
+              <w:t>L.4121-1 — RGPD</w:t>
+            </w:r>
+          </w:p>
+        </w:tc>
+        <w:tc>
+          <w:tcPr>
+            <w:tcW w:type="dxa" w:w="2436"/>
+          </w:tcPr>
+          <w:p>
+            <w:r>
+              <w:rPr>
+                <w:color w:val="555555"/>
+                <w:sz w:val="18"/>
+              </w:rPr>
+              <w:t>Registre tenu et bilan annuel</w:t>
+            </w:r>
+          </w:p>
+        </w:tc>
+      </w:tr>
+      <w:tr>
+        <w:tc>
+          <w:tcPr>
+            <w:tcW w:type="dxa" w:w="2436"/>
+          </w:tcPr>
+          <w:p>
+            <w:r>
+              <w:rPr>
+                <w:b/>
+                <w:color w:val="1F3B57"/>
+                <w:sz w:val="19"/>
+              </w:rPr>
+              <w:t>12</w:t>
+            </w:r>
+          </w:p>
+        </w:tc>
+        <w:tc>
+          <w:tcPr>
+            <w:tcW w:type="dxa" w:w="2436"/>
+          </w:tcPr>
+          <w:p>
+            <w:r>
+              <w:rPr>
+                <w:b/>
+                <w:sz w:val="19"/>
+              </w:rPr>
+              <w:t>Réagir : le protocole, dans l’ordre</w:t>
+            </w:r>
+          </w:p>
+        </w:tc>
+        <w:tc>
+          <w:tcPr>
+            <w:tcW w:type="dxa" w:w="2436"/>
+          </w:tcPr>
+          <w:p>
+            <w:r>
+              <w:rPr>
+                <w:sz w:val="18"/>
+              </w:rPr>
+              <w:t>L.1152-2 à L.1152-4</w:t>
+            </w:r>
+          </w:p>
+        </w:tc>
+        <w:tc>
+          <w:tcPr>
+            <w:tcW w:type="dxa" w:w="2436"/>
+          </w:tcPr>
+          <w:p>
+            <w:r>
+              <w:rPr>
+                <w:color w:val="555555"/>
+                <w:sz w:val="18"/>
+              </w:rPr>
+              <w:t>Accusé de réception, décision motivée, suivi à trois mois</w:t>
+            </w:r>
+          </w:p>
+        </w:tc>
+      </w:tr>
+    </w:tbl>
+    <w:p>
+      <w:pPr>
+        <w:spacing w:before="240" w:after="120"/>
+      </w:pPr>
+      <w:r>
+        <w:rPr>
+          <w:b w:val="0"/>
+          <w:i/>
+          <w:color w:val="555555"/>
+          <w:sz w:val="20"/>
+        </w:rPr>
+        <w:t>Les actions 1 à 6 s’écrivent une fois et se tiennent à jour. Les actions 7, 8 et 9 se renouvellent : rappel de deux heures pour l’encadrement tous les deux ans, information annuelle pour tous. Les actions 10, 11 et 12 sont permanentes.</w:t>
+      </w:r>
+    </w:p>
+    <w:p>
+      <w:r>
+        <w:br w:type="page"/>
+      </w:r>
+    </w:p>
+    <w:p>
+      <w:pPr>
+        <w:spacing w:before="0" w:after="80"/>
+      </w:pPr>
+      <w:r>
+        <w:rPr>
+          <w:b/>
+          <w:i w:val="0"/>
+          <w:color w:val="1F3B57"/>
+          <w:sz w:val="32"/>
+        </w:rPr>
         <w:t>Le socle juridique, en une page</w:t>
       </w:r>
     </w:p>
@@ -251,7 +1089,7 @@
           <w:i w:val="0"/>
           <w:sz w:val="21"/>
         </w:rPr>
-        <w:t>Enfin, la charge de la preuve est aménagée (article L.1154-1) : le salarié présente des éléments de fait laissant supposer un harcèlement, et il revient ensuite à l’employeur de prouver que ses décisions reposent sur des éléments objectifs étrangers à tout harcèlement. C’est pourquoi le module d’objectivation des décisions, en formation de l’encadrement, n’est pas un supplément : c’est le cœur du dispositif.</w:t>
+        <w:t>Enfin, la charge de la preuve est aménagée (article L.1154-1) : le salarié présente des éléments de fait laissant supposer un harcèlement, et il revient ensuite à l’employeur de prouver que ses décisions reposent sur des éléments objectifs étrangers à tout harcèlement. C’est pourquoi le module d’objectivation des décisions, dans l’action 7, n’est pas un supplément : c’est le cœur du dispositif.</w:t>
       </w:r>
     </w:p>
     <w:p>
@@ -270,7 +1108,7 @@
           <w:color w:val="1F3B57"/>
           <w:sz w:val="32"/>
         </w:rPr>
-        <w:t>Programme 1 — Dirigeants et encadrement</w:t>
+        <w:t>Action 1 — Inscrire le risque au document unique</w:t>
       </w:r>
     </w:p>
     <w:p>
@@ -280,6 +1118,889 @@
           <w:bottom w:val="single" w:sz="8" w:color="C9A84C"/>
         </w:pBdr>
       </w:pPr>
+    </w:p>
+    <w:p>
+      <w:pPr>
+        <w:spacing w:before="0" w:after="160"/>
+      </w:pPr>
+      <w:r>
+        <w:rPr>
+          <w:b w:val="0"/>
+          <w:i/>
+          <w:color w:val="A0842E"/>
+          <w:sz w:val="20"/>
+        </w:rPr>
+        <w:t>Article L.4121-3 et article R.4121-1</w:t>
+      </w:r>
+    </w:p>
+    <w:p>
+      <w:pPr>
+        <w:spacing w:before="0" w:after="100"/>
+      </w:pPr>
+      <w:r>
+        <w:rPr>
+          <w:b w:val="0"/>
+          <w:i w:val="0"/>
+          <w:sz w:val="21"/>
+        </w:rPr>
+        <w:t>Le harcèlement n’est pas un incident relationnel : c’est un risque professionnel, au même titre que le bruit ou la manutention. Il s’évalue unité de travail par unité de travail.</w:t>
+      </w:r>
+    </w:p>
+    <w:p>
+      <w:pPr>
+        <w:spacing w:before="0" w:after="100"/>
+      </w:pPr>
+      <w:r>
+        <w:rPr>
+          <w:b w:val="0"/>
+          <w:i w:val="0"/>
+          <w:sz w:val="21"/>
+        </w:rPr>
+        <w:t>Situations à examiner en priorité : travail isolé, relation client difficile, forte pression sur les résultats, réorganisation en cours, encadrement récemment nommé, équipes en sous-effectif.</w:t>
+      </w:r>
+    </w:p>
+    <w:p>
+      <w:pPr>
+        <w:spacing w:before="0" w:after="100"/>
+      </w:pPr>
+      <w:r>
+        <w:rPr>
+          <w:b w:val="0"/>
+          <w:i w:val="0"/>
+          <w:sz w:val="21"/>
+        </w:rPr>
+        <w:t>Pour chaque unité : la situation dangereuse, la gravité, la fréquence, les mesures existantes et les mesures décidées — avec un responsable et une date. Une cotation sans mesure décidée ne sert à rien.</w:t>
+      </w:r>
+    </w:p>
+    <w:p>
+      <w:pPr>
+        <w:spacing w:before="0" w:after="100"/>
+      </w:pPr>
+      <w:r>
+        <w:rPr>
+          <w:b w:val="0"/>
+          <w:i w:val="0"/>
+          <w:sz w:val="21"/>
+        </w:rPr>
+        <w:t>Mise à jour au moins annuelle, et à chaque signalement : un signalement EST une information supplémentaire sur un risque.</w:t>
+      </w:r>
+    </w:p>
+    <w:p>
+      <w:pPr>
+        <w:spacing w:before="240" w:after="80"/>
+      </w:pPr>
+      <w:r>
+        <w:rPr>
+          <w:b/>
+          <w:i w:val="0"/>
+          <w:color w:val="1F3B57"/>
+          <w:sz w:val="25"/>
+        </w:rPr>
+        <w:t>Ce que l’action produit — les pièces à conserver</w:t>
+      </w:r>
+    </w:p>
+    <w:p>
+      <w:pPr>
+        <w:pStyle w:val="ListBullet"/>
+        <w:spacing w:after="40"/>
+      </w:pPr>
+      <w:r>
+        <w:rPr>
+          <w:sz w:val="20"/>
+        </w:rPr>
+        <w:t>Document unique daté, volet risques psychosociaux</w:t>
+      </w:r>
+    </w:p>
+    <w:p>
+      <w:pPr>
+        <w:pStyle w:val="ListBullet"/>
+        <w:spacing w:after="40"/>
+      </w:pPr>
+      <w:r>
+        <w:rPr>
+          <w:sz w:val="20"/>
+        </w:rPr>
+        <w:t>Procès-verbal de consultation du comité</w:t>
+      </w:r>
+    </w:p>
+    <w:p>
+      <w:pPr>
+        <w:pStyle w:val="ListBullet"/>
+        <w:spacing w:after="40"/>
+      </w:pPr>
+      <w:r>
+        <w:rPr>
+          <w:sz w:val="20"/>
+        </w:rPr>
+        <w:t>Plan d’actions avec responsable et échéance</w:t>
+      </w:r>
+    </w:p>
+    <w:p>
+      <w:r>
+        <w:br w:type="page"/>
+      </w:r>
+    </w:p>
+    <w:p>
+      <w:pPr>
+        <w:spacing w:before="0" w:after="80"/>
+      </w:pPr>
+      <w:r>
+        <w:rPr>
+          <w:b/>
+          <w:i w:val="0"/>
+          <w:color w:val="1F3B57"/>
+          <w:sz w:val="32"/>
+        </w:rPr>
+        <w:t>Action 2 — Afficher les textes et les voies de recours</w:t>
+      </w:r>
+    </w:p>
+    <w:p>
+      <w:pPr>
+        <w:spacing w:after="160"/>
+        <w:pBdr>
+          <w:bottom w:val="single" w:sz="8" w:color="C9A84C"/>
+        </w:pBdr>
+      </w:pPr>
+    </w:p>
+    <w:p>
+      <w:pPr>
+        <w:spacing w:before="0" w:after="160"/>
+      </w:pPr>
+      <w:r>
+        <w:rPr>
+          <w:b w:val="0"/>
+          <w:i/>
+          <w:color w:val="A0842E"/>
+          <w:sz w:val="20"/>
+        </w:rPr>
+        <w:t>Articles L.1152-4 et L.1153-5</w:t>
+      </w:r>
+    </w:p>
+    <w:p>
+      <w:pPr>
+        <w:spacing w:before="0" w:after="100"/>
+      </w:pPr>
+      <w:r>
+        <w:rPr>
+          <w:b w:val="0"/>
+          <w:i w:val="0"/>
+          <w:sz w:val="21"/>
+        </w:rPr>
+        <w:t>Le texte de l’article 222-33-2 du code pénal pour le harcèlement moral, celui de l’article 222-33 pour le harcèlement sexuel, les actions contentieuses ouvertes, et les coordonnées des autorités et services compétents.</w:t>
+      </w:r>
+    </w:p>
+    <w:p>
+      <w:pPr>
+        <w:spacing w:before="0" w:after="100"/>
+      </w:pPr>
+      <w:r>
+        <w:rPr>
+          <w:b w:val="0"/>
+          <w:i w:val="0"/>
+          <w:sz w:val="21"/>
+        </w:rPr>
+        <w:t>Doivent y figurer nommément : le médecin du travail ou le service de prévention et de santé au travail, l’inspection du travail compétente avec le nom de l’agent, le Défenseur des droits, le référent de l’entreprise, le référent du comité. Un affichage qui ne nomme personne n’oriente personne.</w:t>
+      </w:r>
+    </w:p>
+    <w:p>
+      <w:pPr>
+        <w:spacing w:before="0" w:after="100"/>
+      </w:pPr>
+      <w:r>
+        <w:rPr>
+          <w:b w:val="0"/>
+          <w:i w:val="0"/>
+          <w:sz w:val="21"/>
+        </w:rPr>
+        <w:t>Où : dans les lieux de travail et dans les locaux ou à la porte des locaux où se fait l’embauche. Sur chaque site. Pour les télétravailleurs et les itinérants, un relais numérique équivalent.</w:t>
+      </w:r>
+    </w:p>
+    <w:p>
+      <w:pPr>
+        <w:spacing w:before="240" w:after="80"/>
+      </w:pPr>
+      <w:r>
+        <w:rPr>
+          <w:b/>
+          <w:i w:val="0"/>
+          <w:color w:val="1F3B57"/>
+          <w:sz w:val="25"/>
+        </w:rPr>
+        <w:t>Ce que l’action produit — les pièces à conserver</w:t>
+      </w:r>
+    </w:p>
+    <w:p>
+      <w:pPr>
+        <w:pStyle w:val="ListBullet"/>
+        <w:spacing w:after="40"/>
+      </w:pPr>
+      <w:r>
+        <w:rPr>
+          <w:sz w:val="20"/>
+        </w:rPr>
+        <w:t>Affiche à jour, par site</w:t>
+      </w:r>
+    </w:p>
+    <w:p>
+      <w:pPr>
+        <w:pStyle w:val="ListBullet"/>
+        <w:spacing w:after="40"/>
+      </w:pPr>
+      <w:r>
+        <w:rPr>
+          <w:sz w:val="20"/>
+        </w:rPr>
+        <w:t>Photographies datées</w:t>
+      </w:r>
+    </w:p>
+    <w:p>
+      <w:pPr>
+        <w:pStyle w:val="ListBullet"/>
+        <w:spacing w:after="40"/>
+      </w:pPr>
+      <w:r>
+        <w:rPr>
+          <w:sz w:val="20"/>
+        </w:rPr>
+        <w:t>Fiche de contrôle semestriel</w:t>
+      </w:r>
+    </w:p>
+    <w:p>
+      <w:r>
+        <w:br w:type="page"/>
+      </w:r>
+    </w:p>
+    <w:p>
+      <w:pPr>
+        <w:spacing w:before="0" w:after="80"/>
+      </w:pPr>
+      <w:r>
+        <w:rPr>
+          <w:b/>
+          <w:i w:val="0"/>
+          <w:color w:val="1F3B57"/>
+          <w:sz w:val="32"/>
+        </w:rPr>
+        <w:t>Action 3 — Compléter le règlement intérieur</w:t>
+      </w:r>
+    </w:p>
+    <w:p>
+      <w:pPr>
+        <w:spacing w:after="160"/>
+        <w:pBdr>
+          <w:bottom w:val="single" w:sz="8" w:color="C9A84C"/>
+        </w:pBdr>
+      </w:pPr>
+    </w:p>
+    <w:p>
+      <w:pPr>
+        <w:spacing w:before="0" w:after="160"/>
+      </w:pPr>
+      <w:r>
+        <w:rPr>
+          <w:b w:val="0"/>
+          <w:i/>
+          <w:color w:val="A0842E"/>
+          <w:sz w:val="20"/>
+        </w:rPr>
+        <w:t>Article L.1321-2</w:t>
+      </w:r>
+    </w:p>
+    <w:p>
+      <w:pPr>
+        <w:spacing w:before="0" w:after="100"/>
+      </w:pPr>
+      <w:r>
+        <w:rPr>
+          <w:b w:val="0"/>
+          <w:i w:val="0"/>
+          <w:sz w:val="21"/>
+        </w:rPr>
+        <w:t>Rappel des dispositions relatives à l’interdiction du harcèlement moral, du harcèlement sexuel et des agissements sexistes. Échelle des sanctions — sans elle, une sanction est inopposable. Procédure disciplinaire.</w:t>
+      </w:r>
+    </w:p>
+    <w:p>
+      <w:pPr>
+        <w:spacing w:before="0" w:after="100"/>
+      </w:pPr>
+      <w:r>
+        <w:rPr>
+          <w:b w:val="0"/>
+          <w:i w:val="0"/>
+          <w:sz w:val="21"/>
+        </w:rPr>
+        <w:t>Ce qu’il ne doit pas contenir : une clause restreignant le droit de dénoncer, imposant un passage obligé par la hiérarchie directe — souvent l’auteur présumé — ou menaçant de sanction le salarié dont la dénonciation ne serait pas confirmée.</w:t>
+      </w:r>
+    </w:p>
+    <w:p>
+      <w:pPr>
+        <w:spacing w:before="0" w:after="100"/>
+      </w:pPr>
+      <w:r>
+        <w:rPr>
+          <w:b w:val="0"/>
+          <w:i w:val="0"/>
+          <w:sz w:val="21"/>
+        </w:rPr>
+        <w:t>Procédure : consultation du comité, transmission à l’inspection du travail, dépôt au greffe du conseil de prud’hommes, affichage, entrée en vigueur un mois après.</w:t>
+      </w:r>
+    </w:p>
+    <w:p>
+      <w:pPr>
+        <w:spacing w:before="0" w:after="100"/>
+      </w:pPr>
+      <w:r>
+        <w:rPr>
+          <w:b w:val="0"/>
+          <w:i w:val="0"/>
+          <w:sz w:val="21"/>
+        </w:rPr>
+        <w:t>À retenir : une procédure d’alerte inscrite au règlement intérieur, même utilisée par la victime, NE SUFFIT PAS à démontrer que toutes les mesures de prévention ont été prises (Cass. soc., 1er juin 2016, n° 14-19.702). C’est la raison d’être des onze autres actions.</w:t>
+      </w:r>
+    </w:p>
+    <w:p>
+      <w:pPr>
+        <w:spacing w:before="240" w:after="80"/>
+      </w:pPr>
+      <w:r>
+        <w:rPr>
+          <w:b/>
+          <w:i w:val="0"/>
+          <w:color w:val="1F3B57"/>
+          <w:sz w:val="25"/>
+        </w:rPr>
+        <w:t>Ce que l’action produit — les pièces à conserver</w:t>
+      </w:r>
+    </w:p>
+    <w:p>
+      <w:pPr>
+        <w:pStyle w:val="ListBullet"/>
+        <w:spacing w:after="40"/>
+      </w:pPr>
+      <w:r>
+        <w:rPr>
+          <w:sz w:val="20"/>
+        </w:rPr>
+        <w:t>Règlement intérieur à jour</w:t>
+      </w:r>
+    </w:p>
+    <w:p>
+      <w:pPr>
+        <w:pStyle w:val="ListBullet"/>
+        <w:spacing w:after="40"/>
+      </w:pPr>
+      <w:r>
+        <w:rPr>
+          <w:sz w:val="20"/>
+        </w:rPr>
+        <w:t>Avis du comité</w:t>
+      </w:r>
+    </w:p>
+    <w:p>
+      <w:pPr>
+        <w:pStyle w:val="ListBullet"/>
+        <w:spacing w:after="40"/>
+      </w:pPr>
+      <w:r>
+        <w:rPr>
+          <w:sz w:val="20"/>
+        </w:rPr>
+        <w:t>Récépissé de dépôt au greffe</w:t>
+      </w:r>
+    </w:p>
+    <w:p>
+      <w:pPr>
+        <w:pStyle w:val="ListBullet"/>
+        <w:spacing w:after="40"/>
+      </w:pPr>
+      <w:r>
+        <w:rPr>
+          <w:sz w:val="20"/>
+        </w:rPr>
+        <w:t>Preuve de transmission à l’inspection du travail</w:t>
+      </w:r>
+    </w:p>
+    <w:p>
+      <w:r>
+        <w:br w:type="page"/>
+      </w:r>
+    </w:p>
+    <w:p>
+      <w:pPr>
+        <w:spacing w:before="0" w:after="80"/>
+      </w:pPr>
+      <w:r>
+        <w:rPr>
+          <w:b/>
+          <w:i w:val="0"/>
+          <w:color w:val="1F3B57"/>
+          <w:sz w:val="32"/>
+        </w:rPr>
+        <w:t>Action 4 — Faire désigner le référent du comité</w:t>
+      </w:r>
+    </w:p>
+    <w:p>
+      <w:pPr>
+        <w:spacing w:after="160"/>
+        <w:pBdr>
+          <w:bottom w:val="single" w:sz="8" w:color="C9A84C"/>
+        </w:pBdr>
+      </w:pPr>
+    </w:p>
+    <w:p>
+      <w:pPr>
+        <w:spacing w:before="0" w:after="160"/>
+      </w:pPr>
+      <w:r>
+        <w:rPr>
+          <w:b w:val="0"/>
+          <w:i/>
+          <w:color w:val="A0842E"/>
+          <w:sz w:val="20"/>
+        </w:rPr>
+        <w:t>Article L.2314-1, dernier alinéa</w:t>
+      </w:r>
+    </w:p>
+    <w:p>
+      <w:pPr>
+        <w:spacing w:before="0" w:after="100"/>
+      </w:pPr>
+      <w:r>
+        <w:rPr>
+          <w:b w:val="0"/>
+          <w:i w:val="0"/>
+          <w:sz w:val="21"/>
+        </w:rPr>
+        <w:t>Le comité désigne parmi ses membres — titulaires ou suppléants — un référent en matière de lutte contre le harcèlement sexuel et les agissements sexistes. Obligatoire dans toute entreprise dotée d’un comité, quelle que soit sa taille.</w:t>
+      </w:r>
+    </w:p>
+    <w:p>
+      <w:pPr>
+        <w:spacing w:before="0" w:after="100"/>
+      </w:pPr>
+      <w:r>
+        <w:rPr>
+          <w:b w:val="0"/>
+          <w:i w:val="0"/>
+          <w:sz w:val="21"/>
+        </w:rPr>
+        <w:t>La désignation prend la forme d’une résolution adoptée à la majorité des membres présents, pour la durée du mandat.</w:t>
+      </w:r>
+    </w:p>
+    <w:p>
+      <w:pPr>
+        <w:spacing w:before="0" w:after="100"/>
+      </w:pPr>
+      <w:r>
+        <w:rPr>
+          <w:b w:val="0"/>
+          <w:i w:val="0"/>
+          <w:sz w:val="21"/>
+        </w:rPr>
+        <w:t>Ses moyens : le temps nécessaire sur le crédit d’heures, une formation, la possibilité d’être reçu par la direction. Un référent désigné sans moyens est une désignation de façade.</w:t>
+      </w:r>
+    </w:p>
+    <w:p>
+      <w:pPr>
+        <w:spacing w:before="0" w:after="100"/>
+      </w:pPr>
+      <w:r>
+        <w:rPr>
+          <w:b w:val="0"/>
+          <w:i w:val="0"/>
+          <w:sz w:val="21"/>
+        </w:rPr>
+        <w:t>Son nom et son contact figurent sur l’affichage et dans le livret d’accueil.</w:t>
+      </w:r>
+    </w:p>
+    <w:p>
+      <w:pPr>
+        <w:spacing w:before="240" w:after="80"/>
+      </w:pPr>
+      <w:r>
+        <w:rPr>
+          <w:b/>
+          <w:i w:val="0"/>
+          <w:color w:val="1F3B57"/>
+          <w:sz w:val="25"/>
+        </w:rPr>
+        <w:t>Ce que l’action produit — les pièces à conserver</w:t>
+      </w:r>
+    </w:p>
+    <w:p>
+      <w:pPr>
+        <w:pStyle w:val="ListBullet"/>
+        <w:spacing w:after="40"/>
+      </w:pPr>
+      <w:r>
+        <w:rPr>
+          <w:sz w:val="20"/>
+        </w:rPr>
+        <w:t>Extrait du procès-verbal de désignation</w:t>
+      </w:r>
+    </w:p>
+    <w:p>
+      <w:pPr>
+        <w:pStyle w:val="ListBullet"/>
+        <w:spacing w:after="40"/>
+      </w:pPr>
+      <w:r>
+        <w:rPr>
+          <w:sz w:val="20"/>
+        </w:rPr>
+        <w:t>Note diffusée avec le nom et le contact</w:t>
+      </w:r>
+    </w:p>
+    <w:p>
+      <w:pPr>
+        <w:pStyle w:val="ListBullet"/>
+        <w:spacing w:after="40"/>
+      </w:pPr>
+      <w:r>
+        <w:rPr>
+          <w:sz w:val="20"/>
+        </w:rPr>
+        <w:t>Attestation de formation</w:t>
+      </w:r>
+    </w:p>
+    <w:p>
+      <w:r>
+        <w:br w:type="page"/>
+      </w:r>
+    </w:p>
+    <w:p>
+      <w:pPr>
+        <w:spacing w:before="0" w:after="80"/>
+      </w:pPr>
+      <w:r>
+        <w:rPr>
+          <w:b/>
+          <w:i w:val="0"/>
+          <w:color w:val="1F3B57"/>
+          <w:sz w:val="32"/>
+        </w:rPr>
+        <w:t>Action 5 — Désigner le référent de l’employeur</w:t>
+      </w:r>
+    </w:p>
+    <w:p>
+      <w:pPr>
+        <w:spacing w:after="160"/>
+        <w:pBdr>
+          <w:bottom w:val="single" w:sz="8" w:color="C9A84C"/>
+        </w:pBdr>
+      </w:pPr>
+    </w:p>
+    <w:p>
+      <w:pPr>
+        <w:spacing w:before="0" w:after="160"/>
+      </w:pPr>
+      <w:r>
+        <w:rPr>
+          <w:b w:val="0"/>
+          <w:i/>
+          <w:color w:val="A0842E"/>
+          <w:sz w:val="20"/>
+        </w:rPr>
+        <w:t>Article L.1153-5-1 — entreprises d’au moins 250 salariés</w:t>
+      </w:r>
+    </w:p>
+    <w:p>
+      <w:pPr>
+        <w:spacing w:before="0" w:after="100"/>
+      </w:pPr>
+      <w:r>
+        <w:rPr>
+          <w:b w:val="0"/>
+          <w:i w:val="0"/>
+          <w:sz w:val="21"/>
+        </w:rPr>
+        <w:t>Une personne accessible, distincte de la ligne hiérarchique directe des équipes exposées, capable de garder une information confidentielle. Le directeur des ressources humaines n’est pas toujours le meilleur choix : il est aussi celui qui sanctionne.</w:t>
+      </w:r>
+    </w:p>
+    <w:p>
+      <w:pPr>
+        <w:spacing w:before="0" w:after="100"/>
+      </w:pPr>
+      <w:r>
+        <w:rPr>
+          <w:b w:val="0"/>
+          <w:i w:val="0"/>
+          <w:sz w:val="21"/>
+        </w:rPr>
+        <w:t>Lettre de mission écrite : périmètre, disponibilité, confidentialité, articulation avec le référent du comité, le service de santé au travail et la direction.</w:t>
+      </w:r>
+    </w:p>
+    <w:p>
+      <w:pPr>
+        <w:spacing w:before="0" w:after="100"/>
+      </w:pPr>
+      <w:r>
+        <w:rPr>
+          <w:b w:val="0"/>
+          <w:i w:val="0"/>
+          <w:sz w:val="21"/>
+        </w:rPr>
+        <w:t>Point annuel avec la direction sur les signalements reçus et les suites données.</w:t>
+      </w:r>
+    </w:p>
+    <w:p>
+      <w:pPr>
+        <w:spacing w:before="240" w:after="80"/>
+      </w:pPr>
+      <w:r>
+        <w:rPr>
+          <w:b/>
+          <w:i w:val="0"/>
+          <w:color w:val="1F3B57"/>
+          <w:sz w:val="25"/>
+        </w:rPr>
+        <w:t>Ce que l’action produit — les pièces à conserver</w:t>
+      </w:r>
+    </w:p>
+    <w:p>
+      <w:pPr>
+        <w:pStyle w:val="ListBullet"/>
+        <w:spacing w:after="40"/>
+      </w:pPr>
+      <w:r>
+        <w:rPr>
+          <w:sz w:val="20"/>
+        </w:rPr>
+        <w:t>Note de désignation</w:t>
+      </w:r>
+    </w:p>
+    <w:p>
+      <w:pPr>
+        <w:pStyle w:val="ListBullet"/>
+        <w:spacing w:after="40"/>
+      </w:pPr>
+      <w:r>
+        <w:rPr>
+          <w:sz w:val="20"/>
+        </w:rPr>
+        <w:t>Lettre de mission</w:t>
+      </w:r>
+    </w:p>
+    <w:p>
+      <w:pPr>
+        <w:pStyle w:val="ListBullet"/>
+        <w:spacing w:after="40"/>
+      </w:pPr>
+      <w:r>
+        <w:rPr>
+          <w:sz w:val="20"/>
+        </w:rPr>
+        <w:t>Attestation de formation</w:t>
+      </w:r>
+    </w:p>
+    <w:p>
+      <w:pPr>
+        <w:pStyle w:val="ListBullet"/>
+        <w:spacing w:after="40"/>
+      </w:pPr>
+      <w:r>
+        <w:rPr>
+          <w:sz w:val="20"/>
+        </w:rPr>
+        <w:t>Compte rendu du point annuel</w:t>
+      </w:r>
+    </w:p>
+    <w:p>
+      <w:r>
+        <w:br w:type="page"/>
+      </w:r>
+    </w:p>
+    <w:p>
+      <w:pPr>
+        <w:spacing w:before="0" w:after="80"/>
+      </w:pPr>
+      <w:r>
+        <w:rPr>
+          <w:b/>
+          <w:i w:val="0"/>
+          <w:color w:val="1F3B57"/>
+          <w:sz w:val="32"/>
+        </w:rPr>
+        <w:t>Action 6 — Écrire et diffuser la procédure de signalement</w:t>
+      </w:r>
+    </w:p>
+    <w:p>
+      <w:pPr>
+        <w:spacing w:after="160"/>
+        <w:pBdr>
+          <w:bottom w:val="single" w:sz="8" w:color="C9A84C"/>
+        </w:pBdr>
+      </w:pPr>
+    </w:p>
+    <w:p>
+      <w:pPr>
+        <w:spacing w:before="0" w:after="160"/>
+      </w:pPr>
+      <w:r>
+        <w:rPr>
+          <w:b w:val="0"/>
+          <w:i/>
+          <w:color w:val="A0842E"/>
+          <w:sz w:val="20"/>
+        </w:rPr>
+        <w:t>Articles L.1152-2, L.1152-4 et L.4121-1 (3°)</w:t>
+      </w:r>
+    </w:p>
+    <w:p>
+      <w:pPr>
+        <w:spacing w:before="0" w:after="100"/>
+      </w:pPr>
+      <w:r>
+        <w:rPr>
+          <w:b w:val="0"/>
+          <w:i w:val="0"/>
+          <w:sz w:val="21"/>
+        </w:rPr>
+        <w:t>Plusieurs portes d’entrée, jamais une seule : supérieur hiérarchique, service RH, référent de l’entreprise, référent du comité, service de santé au travail, élu. Le salarié doit pouvoir contourner sa hiérarchie.</w:t>
+      </w:r>
+    </w:p>
+    <w:p>
+      <w:pPr>
+        <w:spacing w:before="0" w:after="100"/>
+      </w:pPr>
+      <w:r>
+        <w:rPr>
+          <w:b w:val="0"/>
+          <w:i w:val="0"/>
+          <w:sz w:val="21"/>
+        </w:rPr>
+        <w:t>Les délais, écrits et tenus : accusé de réception sous quarante-huit heures, première mesure sous huit jours. C’est la « réaction immédiate » que la jurisprudence exige.</w:t>
+      </w:r>
+    </w:p>
+    <w:p>
+      <w:pPr>
+        <w:spacing w:before="0" w:after="100"/>
+      </w:pPr>
+      <w:r>
+        <w:rPr>
+          <w:b w:val="0"/>
+          <w:i w:val="0"/>
+          <w:sz w:val="21"/>
+        </w:rPr>
+        <w:t>Les mesures conservatoires : séparer sans sanctionner. Ne JAMAIS déplacer la victime contre son gré. Mise à pied conservatoire de l’auteur présumé si les faits sont graves — mesure d’attente, pas sanction.</w:t>
+      </w:r>
+    </w:p>
+    <w:p>
+      <w:pPr>
+        <w:spacing w:before="0" w:after="100"/>
+      </w:pPr>
+      <w:r>
+        <w:rPr>
+          <w:b w:val="0"/>
+          <w:i w:val="0"/>
+          <w:sz w:val="21"/>
+        </w:rPr>
+        <w:t>La confidentialité : qui sait quoi, où se tiennent les auditions, comment les notes sont conservées. Une rumeur qui part de l’enquête est imputable à l’employeur.</w:t>
+      </w:r>
+    </w:p>
+    <w:p>
+      <w:pPr>
+        <w:spacing w:before="0" w:after="100"/>
+      </w:pPr>
+      <w:r>
+        <w:rPr>
+          <w:b w:val="0"/>
+          <w:i w:val="0"/>
+          <w:sz w:val="21"/>
+        </w:rPr>
+        <w:t>La protection du salarié qui dénonce, écrite en toutes lettres : c’est ce qui délie les langues.</w:t>
+      </w:r>
+    </w:p>
+    <w:p>
+      <w:pPr>
+        <w:spacing w:before="240" w:after="80"/>
+      </w:pPr>
+      <w:r>
+        <w:rPr>
+          <w:b/>
+          <w:i w:val="0"/>
+          <w:color w:val="1F3B57"/>
+          <w:sz w:val="25"/>
+        </w:rPr>
+        <w:t>Ce que l’action produit — les pièces à conserver</w:t>
+      </w:r>
+    </w:p>
+    <w:p>
+      <w:pPr>
+        <w:pStyle w:val="ListBullet"/>
+        <w:spacing w:after="40"/>
+      </w:pPr>
+      <w:r>
+        <w:rPr>
+          <w:sz w:val="20"/>
+        </w:rPr>
+        <w:t>Procédure écrite</w:t>
+      </w:r>
+    </w:p>
+    <w:p>
+      <w:pPr>
+        <w:pStyle w:val="ListBullet"/>
+        <w:spacing w:after="40"/>
+      </w:pPr>
+      <w:r>
+        <w:rPr>
+          <w:sz w:val="20"/>
+        </w:rPr>
+        <w:t>Preuve de diffusion horodatée</w:t>
+      </w:r>
+    </w:p>
+    <w:p>
+      <w:pPr>
+        <w:pStyle w:val="ListBullet"/>
+        <w:spacing w:after="40"/>
+      </w:pPr>
+      <w:r>
+        <w:rPr>
+          <w:sz w:val="20"/>
+        </w:rPr>
+        <w:t>Modèles : accusé de réception, convocation, compte rendu, décision</w:t>
+      </w:r>
+    </w:p>
+    <w:p>
+      <w:r>
+        <w:br w:type="page"/>
+      </w:r>
+    </w:p>
+    <w:p>
+      <w:pPr>
+        <w:spacing w:before="0" w:after="80"/>
+      </w:pPr>
+      <w:r>
+        <w:rPr>
+          <w:b/>
+          <w:i w:val="0"/>
+          <w:color w:val="1F3B57"/>
+          <w:sz w:val="32"/>
+        </w:rPr>
+        <w:t>Action 7 — Former les dirigeants et l’encadrement</w:t>
+      </w:r>
+    </w:p>
+    <w:p>
+      <w:pPr>
+        <w:spacing w:after="160"/>
+        <w:pBdr>
+          <w:bottom w:val="single" w:sz="8" w:color="C9A84C"/>
+        </w:pBdr>
+      </w:pPr>
+    </w:p>
+    <w:p>
+      <w:pPr>
+        <w:spacing w:before="0" w:after="160"/>
+      </w:pPr>
+      <w:r>
+        <w:rPr>
+          <w:b w:val="0"/>
+          <w:i/>
+          <w:color w:val="A0842E"/>
+          <w:sz w:val="20"/>
+        </w:rPr>
+        <w:t>Article L.4121-1 (2°) — programme de formation, sept heures</w:t>
+      </w:r>
     </w:p>
     <w:p>
       <w:pPr>
@@ -2207,7 +3928,7 @@
           <w:color w:val="1F3B57"/>
           <w:sz w:val="32"/>
         </w:rPr>
-        <w:t>Programme 2 — Les référents</w:t>
+        <w:t>Action 8 — Former les référents</w:t>
       </w:r>
     </w:p>
     <w:p>
@@ -2217,6 +3938,20 @@
           <w:bottom w:val="single" w:sz="8" w:color="C9A84C"/>
         </w:pBdr>
       </w:pPr>
+    </w:p>
+    <w:p>
+      <w:pPr>
+        <w:spacing w:before="0" w:after="160"/>
+      </w:pPr>
+      <w:r>
+        <w:rPr>
+          <w:b w:val="0"/>
+          <w:i/>
+          <w:color w:val="A0842E"/>
+          <w:sz w:val="20"/>
+        </w:rPr>
+        <w:t>Articles L.2315-18 et L.4121-1 (2°) — programme de formation, quatorze heures</w:t>
+      </w:r>
     </w:p>
     <w:p>
       <w:pPr>
@@ -2254,7 +3989,7 @@
           <w:i w:val="0"/>
           <w:sz w:val="21"/>
         </w:rPr>
-        <w:t>Objectif. Le référent est le point d’entrée. Mal formé, il devient le premier vice de procédure : promesse de confidentialité intenable, enquête bâclée, notes non datées, victime déplacée. Ce programme reprend le socle de la formation de l’encadrement, puis ajoute ce qui lui est propre.</w:t>
+        <w:t>Objectif. Le référent est le point d’entrée. Mal formé, il devient le premier vice de procédure : promesse de confidentialité intenable, enquête bâclée, notes non datées, victime déplacée. Ce programme reprend le socle de l’action 7, puis ajoute ce qui lui est propre.</w:t>
       </w:r>
     </w:p>
     <w:p>
@@ -2287,7 +4022,7 @@
           <w:i w:val="0"/>
           <w:sz w:val="21"/>
         </w:rPr>
-        <w:t>Reprise intégrale des modules 1 à 5 et 8 du programme de l’encadrement : définition et ses trois pièges, l’intention qui ne compte pas, ce que les juges retiennent, ce qu’ils écartent, le harcèlement managérial et institutionnel, les conséquences chiffrées.</w:t>
+        <w:t>Reprise intégrale des modules 1 à 5 et 8 de l’action 7 : définition et ses trois pièges, l’intention qui ne compte pas, ce que les juges retiennent, ce qu’ils écartent, le harcèlement managérial et institutionnel, les conséquences chiffrées.</w:t>
       </w:r>
     </w:p>
     <w:p>
@@ -2645,7 +4380,7 @@
           <w:i w:val="0"/>
           <w:sz w:val="21"/>
         </w:rPr>
-        <w:t>Information du comité, sans nommer les personnes. Mise à jour du document unique si le signalement révèle un risque non identifié.</w:t>
+        <w:t>Information du comité, sans nommer les personnes. Mise à jour du document unique si le signalement révèle un risque non identifié — c’est le retour vers l’action 1.</w:t>
       </w:r>
     </w:p>
     <w:p>
@@ -3526,7 +5261,7 @@
           <w:color w:val="1F3B57"/>
           <w:sz w:val="32"/>
         </w:rPr>
-        <w:t>Programme 3 — Information de l’ensemble des salariés</w:t>
+        <w:t>Action 9 — Informer l’ensemble des salariés</w:t>
       </w:r>
     </w:p>
     <w:p>
@@ -3536,6 +5271,20 @@
           <w:bottom w:val="single" w:sz="8" w:color="C9A84C"/>
         </w:pBdr>
       </w:pPr>
+    </w:p>
+    <w:p>
+      <w:pPr>
+        <w:spacing w:before="0" w:after="160"/>
+      </w:pPr>
+      <w:r>
+        <w:rPr>
+          <w:b w:val="0"/>
+          <w:i/>
+          <w:color w:val="A0842E"/>
+          <w:sz w:val="20"/>
+        </w:rPr>
+        <w:t>Article L.4121-1 (2°) — programme d’information, une heure trente</w:t>
+      </w:r>
     </w:p>
     <w:p>
       <w:pPr>
@@ -4913,7 +6662,7 @@
           <w:color w:val="1F3B57"/>
           <w:sz w:val="32"/>
         </w:rPr>
-        <w:t>Les neuf actions d’organisation</w:t>
+        <w:t>Action 10 — Informer à l’embauche</w:t>
       </w:r>
     </w:p>
     <w:p>
@@ -4926,622 +6675,14 @@
     </w:p>
     <w:p>
       <w:pPr>
-        <w:spacing w:before="120" w:after="200"/>
-      </w:pPr>
-      <w:r>
-        <w:rPr>
-          <w:b w:val="0"/>
-          <w:i w:val="0"/>
-          <w:sz w:val="21"/>
-        </w:rPr>
-        <w:t>Les trois programmes ci-dessus ne valent que s’ils sont entourés. Voici les neuf autres actions, avec ce qu’elles produisent.</w:t>
-      </w:r>
-    </w:p>
-    <w:p>
-      <w:pPr>
-        <w:spacing w:before="320" w:after="80"/>
-      </w:pPr>
-      <w:r>
-        <w:rPr>
-          <w:b/>
-          <w:i w:val="0"/>
-          <w:color w:val="1F3B57"/>
-          <w:sz w:val="25"/>
-        </w:rPr>
-        <w:t>1 · Inscrire le risque au document unique</w:t>
-      </w:r>
-    </w:p>
-    <w:p>
-      <w:pPr>
-        <w:spacing w:before="0" w:after="100"/>
+        <w:spacing w:before="0" w:after="160"/>
       </w:pPr>
       <w:r>
         <w:rPr>
           <w:b w:val="0"/>
           <w:i/>
           <w:color w:val="A0842E"/>
-          <w:sz w:val="19"/>
-        </w:rPr>
-        <w:t>Article L.4121-3 et R.4121-1</w:t>
-      </w:r>
-    </w:p>
-    <w:p>
-      <w:pPr>
-        <w:spacing w:before="0" w:after="100"/>
-      </w:pPr>
-      <w:r>
-        <w:rPr>
-          <w:b w:val="0"/>
-          <w:i w:val="0"/>
-          <w:sz w:val="21"/>
-        </w:rPr>
-        <w:t>Le harcèlement n’est pas un incident relationnel : c’est un risque professionnel, au même titre que le bruit ou la manutention. Il s’évalue unité de travail par unité de travail.</w:t>
-      </w:r>
-    </w:p>
-    <w:p>
-      <w:pPr>
-        <w:spacing w:before="0" w:after="100"/>
-      </w:pPr>
-      <w:r>
-        <w:rPr>
-          <w:b w:val="0"/>
-          <w:i w:val="0"/>
-          <w:sz w:val="21"/>
-        </w:rPr>
-        <w:t>Situations à examiner en priorité : travail isolé, relation client difficile, forte pression sur les résultats, réorganisation en cours, encadrement récemment nommé, équipes en sous-effectif.</w:t>
-      </w:r>
-    </w:p>
-    <w:p>
-      <w:pPr>
-        <w:spacing w:before="0" w:after="100"/>
-      </w:pPr>
-      <w:r>
-        <w:rPr>
-          <w:b w:val="0"/>
-          <w:i w:val="0"/>
-          <w:sz w:val="21"/>
-        </w:rPr>
-        <w:t>Pour chaque unité : la situation dangereuse, la gravité, la fréquence, les mesures existantes et les mesures décidées — avec un responsable et une date. Une cotation sans mesure décidée ne sert à rien.</w:t>
-      </w:r>
-    </w:p>
-    <w:p>
-      <w:pPr>
-        <w:spacing w:before="0" w:after="100"/>
-      </w:pPr>
-      <w:r>
-        <w:rPr>
-          <w:b w:val="0"/>
-          <w:i w:val="0"/>
-          <w:sz w:val="21"/>
-        </w:rPr>
-        <w:t>Mise à jour au moins annuelle, et à chaque signalement : un signalement EST une information supplémentaire sur un risque.</w:t>
-      </w:r>
-    </w:p>
-    <w:p>
-      <w:pPr>
-        <w:spacing w:after="80"/>
-      </w:pPr>
-      <w:r>
-        <w:rPr>
-          <w:b/>
           <w:sz w:val="20"/>
-        </w:rPr>
-        <w:t xml:space="preserve">Pièces à conserver : </w:t>
-      </w:r>
-      <w:r>
-        <w:rPr>
-          <w:color w:val="555555"/>
-          <w:sz w:val="20"/>
-        </w:rPr>
-        <w:t>Document unique daté, volet risques psychosociaux · Procès-verbal de consultation du comité · Plan d’actions avec responsable et échéance</w:t>
-      </w:r>
-    </w:p>
-    <w:p>
-      <w:pPr>
-        <w:spacing w:before="320" w:after="80"/>
-      </w:pPr>
-      <w:r>
-        <w:rPr>
-          <w:b/>
-          <w:i w:val="0"/>
-          <w:color w:val="1F3B57"/>
-          <w:sz w:val="25"/>
-        </w:rPr>
-        <w:t>2 · Afficher les textes et les voies de recours</w:t>
-      </w:r>
-    </w:p>
-    <w:p>
-      <w:pPr>
-        <w:spacing w:before="0" w:after="100"/>
-      </w:pPr>
-      <w:r>
-        <w:rPr>
-          <w:b w:val="0"/>
-          <w:i/>
-          <w:color w:val="A0842E"/>
-          <w:sz w:val="19"/>
-        </w:rPr>
-        <w:t>Articles L.1152-4 et L.1153-5</w:t>
-      </w:r>
-    </w:p>
-    <w:p>
-      <w:pPr>
-        <w:spacing w:before="0" w:after="100"/>
-      </w:pPr>
-      <w:r>
-        <w:rPr>
-          <w:b w:val="0"/>
-          <w:i w:val="0"/>
-          <w:sz w:val="21"/>
-        </w:rPr>
-        <w:t>Le texte de l’article 222-33-2 du code pénal pour le harcèlement moral, celui de l’article 222-33 pour le harcèlement sexuel, les actions contentieuses ouvertes, et les coordonnées des autorités et services compétents.</w:t>
-      </w:r>
-    </w:p>
-    <w:p>
-      <w:pPr>
-        <w:spacing w:before="0" w:after="100"/>
-      </w:pPr>
-      <w:r>
-        <w:rPr>
-          <w:b w:val="0"/>
-          <w:i w:val="0"/>
-          <w:sz w:val="21"/>
-        </w:rPr>
-        <w:t>Doivent y figurer nommément : le médecin du travail ou le service de prévention et de santé au travail, l’inspection du travail compétente avec le nom de l’agent, le Défenseur des droits, le référent de l’entreprise, le référent du comité. Un affichage qui ne nomme personne n’oriente personne.</w:t>
-      </w:r>
-    </w:p>
-    <w:p>
-      <w:pPr>
-        <w:spacing w:before="0" w:after="100"/>
-      </w:pPr>
-      <w:r>
-        <w:rPr>
-          <w:b w:val="0"/>
-          <w:i w:val="0"/>
-          <w:sz w:val="21"/>
-        </w:rPr>
-        <w:t>Où : dans les lieux de travail et dans les locaux ou à la porte des locaux où se fait l’embauche. Sur chaque site. Pour les télétravailleurs et les itinérants, un relais numérique équivalent.</w:t>
-      </w:r>
-    </w:p>
-    <w:p>
-      <w:pPr>
-        <w:spacing w:after="80"/>
-      </w:pPr>
-      <w:r>
-        <w:rPr>
-          <w:b/>
-          <w:sz w:val="20"/>
-        </w:rPr>
-        <w:t xml:space="preserve">Pièces à conserver : </w:t>
-      </w:r>
-      <w:r>
-        <w:rPr>
-          <w:color w:val="555555"/>
-          <w:sz w:val="20"/>
-        </w:rPr>
-        <w:t>Affiche à jour, par site · Photographies datées · Fiche de contrôle semestriel</w:t>
-      </w:r>
-    </w:p>
-    <w:p>
-      <w:pPr>
-        <w:spacing w:before="320" w:after="80"/>
-      </w:pPr>
-      <w:r>
-        <w:rPr>
-          <w:b/>
-          <w:i w:val="0"/>
-          <w:color w:val="1F3B57"/>
-          <w:sz w:val="25"/>
-        </w:rPr>
-        <w:t>3 · Compléter le règlement intérieur</w:t>
-      </w:r>
-    </w:p>
-    <w:p>
-      <w:pPr>
-        <w:spacing w:before="0" w:after="100"/>
-      </w:pPr>
-      <w:r>
-        <w:rPr>
-          <w:b w:val="0"/>
-          <w:i/>
-          <w:color w:val="A0842E"/>
-          <w:sz w:val="19"/>
-        </w:rPr>
-        <w:t>Article L.1321-2</w:t>
-      </w:r>
-    </w:p>
-    <w:p>
-      <w:pPr>
-        <w:spacing w:before="0" w:after="100"/>
-      </w:pPr>
-      <w:r>
-        <w:rPr>
-          <w:b w:val="0"/>
-          <w:i w:val="0"/>
-          <w:sz w:val="21"/>
-        </w:rPr>
-        <w:t>Rappel des dispositions relatives à l’interdiction du harcèlement moral, du harcèlement sexuel et des agissements sexistes. Échelle des sanctions — sans elle, une sanction est inopposable. Procédure disciplinaire.</w:t>
-      </w:r>
-    </w:p>
-    <w:p>
-      <w:pPr>
-        <w:spacing w:before="0" w:after="100"/>
-      </w:pPr>
-      <w:r>
-        <w:rPr>
-          <w:b w:val="0"/>
-          <w:i w:val="0"/>
-          <w:sz w:val="21"/>
-        </w:rPr>
-        <w:t>Ce qu’il ne doit pas contenir : une clause restreignant le droit de dénoncer, imposant un passage obligé par la hiérarchie directe — souvent l’auteur présumé — ou menaçant de sanction le salarié dont la dénonciation ne serait pas confirmée.</w:t>
-      </w:r>
-    </w:p>
-    <w:p>
-      <w:pPr>
-        <w:spacing w:before="0" w:after="100"/>
-      </w:pPr>
-      <w:r>
-        <w:rPr>
-          <w:b w:val="0"/>
-          <w:i w:val="0"/>
-          <w:sz w:val="21"/>
-        </w:rPr>
-        <w:t>Procédure : consultation du comité, transmission à l’inspection du travail, dépôt au greffe du conseil de prud’hommes, affichage, entrée en vigueur un mois après.</w:t>
-      </w:r>
-    </w:p>
-    <w:p>
-      <w:pPr>
-        <w:spacing w:before="0" w:after="100"/>
-      </w:pPr>
-      <w:r>
-        <w:rPr>
-          <w:b w:val="0"/>
-          <w:i w:val="0"/>
-          <w:sz w:val="21"/>
-        </w:rPr>
-        <w:t>À retenir : une procédure d’alerte inscrite au règlement intérieur, même utilisée par la victime, NE SUFFIT PAS à démontrer que toutes les mesures de prévention ont été prises (Cass. soc., 1er juin 2016, n° 14-19.702).</w:t>
-      </w:r>
-    </w:p>
-    <w:p>
-      <w:pPr>
-        <w:spacing w:after="80"/>
-      </w:pPr>
-      <w:r>
-        <w:rPr>
-          <w:b/>
-          <w:sz w:val="20"/>
-        </w:rPr>
-        <w:t xml:space="preserve">Pièces à conserver : </w:t>
-      </w:r>
-      <w:r>
-        <w:rPr>
-          <w:color w:val="555555"/>
-          <w:sz w:val="20"/>
-        </w:rPr>
-        <w:t>Règlement intérieur à jour · Avis du comité · Récépissé de dépôt au greffe · Preuve de transmission à l’inspection du travail</w:t>
-      </w:r>
-    </w:p>
-    <w:p>
-      <w:pPr>
-        <w:spacing w:before="320" w:after="80"/>
-      </w:pPr>
-      <w:r>
-        <w:rPr>
-          <w:b/>
-          <w:i w:val="0"/>
-          <w:color w:val="1F3B57"/>
-          <w:sz w:val="25"/>
-        </w:rPr>
-        <w:t>4 · Faire désigner le référent du comité</w:t>
-      </w:r>
-    </w:p>
-    <w:p>
-      <w:pPr>
-        <w:spacing w:before="0" w:after="100"/>
-      </w:pPr>
-      <w:r>
-        <w:rPr>
-          <w:b w:val="0"/>
-          <w:i/>
-          <w:color w:val="A0842E"/>
-          <w:sz w:val="19"/>
-        </w:rPr>
-        <w:t>Article L.2314-1, dernier alinéa</w:t>
-      </w:r>
-    </w:p>
-    <w:p>
-      <w:pPr>
-        <w:spacing w:before="0" w:after="100"/>
-      </w:pPr>
-      <w:r>
-        <w:rPr>
-          <w:b w:val="0"/>
-          <w:i w:val="0"/>
-          <w:sz w:val="21"/>
-        </w:rPr>
-        <w:t>Le comité désigne parmi ses membres — titulaires ou suppléants — un référent en matière de lutte contre le harcèlement sexuel et les agissements sexistes. Obligatoire dans toute entreprise dotée d’un comité, quelle que soit sa taille.</w:t>
-      </w:r>
-    </w:p>
-    <w:p>
-      <w:pPr>
-        <w:spacing w:before="0" w:after="100"/>
-      </w:pPr>
-      <w:r>
-        <w:rPr>
-          <w:b w:val="0"/>
-          <w:i w:val="0"/>
-          <w:sz w:val="21"/>
-        </w:rPr>
-        <w:t>La désignation prend la forme d’une résolution adoptée à la majorité des membres présents, pour la durée du mandat.</w:t>
-      </w:r>
-    </w:p>
-    <w:p>
-      <w:pPr>
-        <w:spacing w:before="0" w:after="100"/>
-      </w:pPr>
-      <w:r>
-        <w:rPr>
-          <w:b w:val="0"/>
-          <w:i w:val="0"/>
-          <w:sz w:val="21"/>
-        </w:rPr>
-        <w:t>Ses moyens : le temps nécessaire sur le crédit d’heures, une formation, la possibilité d’être reçu par la direction. Un référent désigné sans moyens est une désignation de façade.</w:t>
-      </w:r>
-    </w:p>
-    <w:p>
-      <w:pPr>
-        <w:spacing w:before="0" w:after="100"/>
-      </w:pPr>
-      <w:r>
-        <w:rPr>
-          <w:b w:val="0"/>
-          <w:i w:val="0"/>
-          <w:sz w:val="21"/>
-        </w:rPr>
-        <w:t>Son nom et son contact figurent sur l’affichage et dans le livret d’accueil.</w:t>
-      </w:r>
-    </w:p>
-    <w:p>
-      <w:pPr>
-        <w:spacing w:after="80"/>
-      </w:pPr>
-      <w:r>
-        <w:rPr>
-          <w:b/>
-          <w:sz w:val="20"/>
-        </w:rPr>
-        <w:t xml:space="preserve">Pièces à conserver : </w:t>
-      </w:r>
-      <w:r>
-        <w:rPr>
-          <w:color w:val="555555"/>
-          <w:sz w:val="20"/>
-        </w:rPr>
-        <w:t>Extrait du procès-verbal de désignation · Note diffusée avec le nom et le contact · Attestation de formation</w:t>
-      </w:r>
-    </w:p>
-    <w:p>
-      <w:pPr>
-        <w:spacing w:before="320" w:after="80"/>
-      </w:pPr>
-      <w:r>
-        <w:rPr>
-          <w:b/>
-          <w:i w:val="0"/>
-          <w:color w:val="1F3B57"/>
-          <w:sz w:val="25"/>
-        </w:rPr>
-        <w:t>5 · Désigner le référent de l’employeur</w:t>
-      </w:r>
-    </w:p>
-    <w:p>
-      <w:pPr>
-        <w:spacing w:before="0" w:after="100"/>
-      </w:pPr>
-      <w:r>
-        <w:rPr>
-          <w:b w:val="0"/>
-          <w:i/>
-          <w:color w:val="A0842E"/>
-          <w:sz w:val="19"/>
-        </w:rPr>
-        <w:t>Article L.1153-5-1 — entreprises d’au moins 250 salariés</w:t>
-      </w:r>
-    </w:p>
-    <w:p>
-      <w:pPr>
-        <w:spacing w:before="0" w:after="100"/>
-      </w:pPr>
-      <w:r>
-        <w:rPr>
-          <w:b w:val="0"/>
-          <w:i w:val="0"/>
-          <w:sz w:val="21"/>
-        </w:rPr>
-        <w:t>Une personne accessible, distincte de la ligne hiérarchique directe des équipes exposées, capable de garder une information confidentielle. Le directeur des ressources humaines n’est pas toujours le meilleur choix : il est aussi celui qui sanctionne.</w:t>
-      </w:r>
-    </w:p>
-    <w:p>
-      <w:pPr>
-        <w:spacing w:before="0" w:after="100"/>
-      </w:pPr>
-      <w:r>
-        <w:rPr>
-          <w:b w:val="0"/>
-          <w:i w:val="0"/>
-          <w:sz w:val="21"/>
-        </w:rPr>
-        <w:t>Lettre de mission écrite : périmètre, disponibilité, confidentialité, articulation avec le référent du comité, le service de santé au travail et la direction.</w:t>
-      </w:r>
-    </w:p>
-    <w:p>
-      <w:pPr>
-        <w:spacing w:before="0" w:after="100"/>
-      </w:pPr>
-      <w:r>
-        <w:rPr>
-          <w:b w:val="0"/>
-          <w:i w:val="0"/>
-          <w:sz w:val="21"/>
-        </w:rPr>
-        <w:t>Point annuel avec la direction sur les signalements reçus et les suites données.</w:t>
-      </w:r>
-    </w:p>
-    <w:p>
-      <w:pPr>
-        <w:spacing w:after="80"/>
-      </w:pPr>
-      <w:r>
-        <w:rPr>
-          <w:b/>
-          <w:sz w:val="20"/>
-        </w:rPr>
-        <w:t xml:space="preserve">Pièces à conserver : </w:t>
-      </w:r>
-      <w:r>
-        <w:rPr>
-          <w:color w:val="555555"/>
-          <w:sz w:val="20"/>
-        </w:rPr>
-        <w:t>Note de désignation · Lettre de mission · Attestation de formation · Compte rendu du point annuel</w:t>
-      </w:r>
-    </w:p>
-    <w:p>
-      <w:pPr>
-        <w:spacing w:before="320" w:after="80"/>
-      </w:pPr>
-      <w:r>
-        <w:rPr>
-          <w:b/>
-          <w:i w:val="0"/>
-          <w:color w:val="1F3B57"/>
-          <w:sz w:val="25"/>
-        </w:rPr>
-        <w:t>6 · Écrire et diffuser la procédure de signalement</w:t>
-      </w:r>
-    </w:p>
-    <w:p>
-      <w:pPr>
-        <w:spacing w:before="0" w:after="100"/>
-      </w:pPr>
-      <w:r>
-        <w:rPr>
-          <w:b w:val="0"/>
-          <w:i/>
-          <w:color w:val="A0842E"/>
-          <w:sz w:val="19"/>
-        </w:rPr>
-        <w:t>Articles L.1152-2, L.1152-4 et L.4121-1 (3°)</w:t>
-      </w:r>
-    </w:p>
-    <w:p>
-      <w:pPr>
-        <w:spacing w:before="0" w:after="100"/>
-      </w:pPr>
-      <w:r>
-        <w:rPr>
-          <w:b w:val="0"/>
-          <w:i w:val="0"/>
-          <w:sz w:val="21"/>
-        </w:rPr>
-        <w:t>Plusieurs portes d’entrée, jamais une seule : supérieur hiérarchique, service RH, référent de l’entreprise, référent du comité, service de santé au travail, élu. Le salarié doit pouvoir contourner sa hiérarchie.</w:t>
-      </w:r>
-    </w:p>
-    <w:p>
-      <w:pPr>
-        <w:spacing w:before="0" w:after="100"/>
-      </w:pPr>
-      <w:r>
-        <w:rPr>
-          <w:b w:val="0"/>
-          <w:i w:val="0"/>
-          <w:sz w:val="21"/>
-        </w:rPr>
-        <w:t>Les délais, écrits et tenus : accusé de réception sous quarante-huit heures, première mesure sous huit jours. C’est la « réaction immédiate » que la jurisprudence exige.</w:t>
-      </w:r>
-    </w:p>
-    <w:p>
-      <w:pPr>
-        <w:spacing w:before="0" w:after="100"/>
-      </w:pPr>
-      <w:r>
-        <w:rPr>
-          <w:b w:val="0"/>
-          <w:i w:val="0"/>
-          <w:sz w:val="21"/>
-        </w:rPr>
-        <w:t>Les mesures conservatoires : séparer sans sanctionner. Ne JAMAIS déplacer la victime contre son gré. Mise à pied conservatoire de l’auteur présumé si les faits sont graves — mesure d’attente, pas sanction.</w:t>
-      </w:r>
-    </w:p>
-    <w:p>
-      <w:pPr>
-        <w:spacing w:before="0" w:after="100"/>
-      </w:pPr>
-      <w:r>
-        <w:rPr>
-          <w:b w:val="0"/>
-          <w:i w:val="0"/>
-          <w:sz w:val="21"/>
-        </w:rPr>
-        <w:t>La confidentialité : qui sait quoi, où se tiennent les auditions, comment les notes sont conservées. Une rumeur qui part de l’enquête est imputable à l’employeur.</w:t>
-      </w:r>
-    </w:p>
-    <w:p>
-      <w:pPr>
-        <w:spacing w:before="0" w:after="100"/>
-      </w:pPr>
-      <w:r>
-        <w:rPr>
-          <w:b w:val="0"/>
-          <w:i w:val="0"/>
-          <w:sz w:val="21"/>
-        </w:rPr>
-        <w:t>La protection du salarié qui dénonce, écrite en toutes lettres : c’est ce qui délie les langues.</w:t>
-      </w:r>
-    </w:p>
-    <w:p>
-      <w:pPr>
-        <w:spacing w:after="80"/>
-      </w:pPr>
-      <w:r>
-        <w:rPr>
-          <w:b/>
-          <w:sz w:val="20"/>
-        </w:rPr>
-        <w:t xml:space="preserve">Pièces à conserver : </w:t>
-      </w:r>
-      <w:r>
-        <w:rPr>
-          <w:color w:val="555555"/>
-          <w:sz w:val="20"/>
-        </w:rPr>
-        <w:t>Procédure écrite · Preuve de diffusion horodatée · Modèles : accusé de réception, convocation, compte rendu, décision</w:t>
-      </w:r>
-    </w:p>
-    <w:p>
-      <w:pPr>
-        <w:spacing w:before="320" w:after="80"/>
-      </w:pPr>
-      <w:r>
-        <w:rPr>
-          <w:b/>
-          <w:i w:val="0"/>
-          <w:color w:val="1F3B57"/>
-          <w:sz w:val="25"/>
-        </w:rPr>
-        <w:t>7 · Informer à l’embauche</w:t>
-      </w:r>
-    </w:p>
-    <w:p>
-      <w:pPr>
-        <w:spacing w:before="0" w:after="100"/>
-      </w:pPr>
-      <w:r>
-        <w:rPr>
-          <w:b w:val="0"/>
-          <w:i/>
-          <w:color w:val="A0842E"/>
-          <w:sz w:val="19"/>
         </w:rPr>
         <w:t>Article L.4121-1 (2°)</w:t>
       </w:r>
@@ -5587,26 +6728,7 @@
     </w:p>
     <w:p>
       <w:pPr>
-        <w:spacing w:after="80"/>
-      </w:pPr>
-      <w:r>
-        <w:rPr>
-          <w:b/>
-          <w:sz w:val="20"/>
-        </w:rPr>
-        <w:t xml:space="preserve">Pièces à conserver : </w:t>
-      </w:r>
-      <w:r>
-        <w:rPr>
-          <w:color w:val="555555"/>
-          <w:sz w:val="20"/>
-        </w:rPr>
-        <w:t>Notice d’information · Émargement signé et daté · Contrôle mensuel entrants / émargements</w:t>
-      </w:r>
-    </w:p>
-    <w:p>
-      <w:pPr>
-        <w:spacing w:before="320" w:after="80"/>
+        <w:spacing w:before="240" w:after="80"/>
       </w:pPr>
       <w:r>
         <w:rPr>
@@ -5615,19 +6737,82 @@
           <w:color w:val="1F3B57"/>
           <w:sz w:val="25"/>
         </w:rPr>
-        <w:t>8 · Tenir le registre des signalements</w:t>
+        <w:t>Ce que l’action produit — les pièces à conserver</w:t>
       </w:r>
     </w:p>
     <w:p>
       <w:pPr>
-        <w:spacing w:before="0" w:after="100"/>
+        <w:pStyle w:val="ListBullet"/>
+        <w:spacing w:after="40"/>
+      </w:pPr>
+      <w:r>
+        <w:rPr>
+          <w:sz w:val="20"/>
+        </w:rPr>
+        <w:t>Notice d’information</w:t>
+      </w:r>
+    </w:p>
+    <w:p>
+      <w:pPr>
+        <w:pStyle w:val="ListBullet"/>
+        <w:spacing w:after="40"/>
+      </w:pPr>
+      <w:r>
+        <w:rPr>
+          <w:sz w:val="20"/>
+        </w:rPr>
+        <w:t>Émargement signé et daté</w:t>
+      </w:r>
+    </w:p>
+    <w:p>
+      <w:pPr>
+        <w:pStyle w:val="ListBullet"/>
+        <w:spacing w:after="40"/>
+      </w:pPr>
+      <w:r>
+        <w:rPr>
+          <w:sz w:val="20"/>
+        </w:rPr>
+        <w:t>Contrôle mensuel entrants / émargements</w:t>
+      </w:r>
+    </w:p>
+    <w:p>
+      <w:r>
+        <w:br w:type="page"/>
+      </w:r>
+    </w:p>
+    <w:p>
+      <w:pPr>
+        <w:spacing w:before="0" w:after="80"/>
+      </w:pPr>
+      <w:r>
+        <w:rPr>
+          <w:b/>
+          <w:i w:val="0"/>
+          <w:color w:val="1F3B57"/>
+          <w:sz w:val="32"/>
+        </w:rPr>
+        <w:t>Action 11 — Tenir le registre des signalements</w:t>
+      </w:r>
+    </w:p>
+    <w:p>
+      <w:pPr>
+        <w:spacing w:after="160"/>
+        <w:pBdr>
+          <w:bottom w:val="single" w:sz="8" w:color="C9A84C"/>
+        </w:pBdr>
+      </w:pPr>
+    </w:p>
+    <w:p>
+      <w:pPr>
+        <w:spacing w:before="0" w:after="160"/>
       </w:pPr>
       <w:r>
         <w:rPr>
           <w:b w:val="0"/>
           <w:i/>
           <w:color w:val="A0842E"/>
-          <w:sz w:val="19"/>
+          <w:sz w:val="20"/>
         </w:rPr>
         <w:t>Article L.4121-1 — RGPD pour les données</w:t>
       </w:r>
@@ -5681,31 +6866,12 @@
           <w:i w:val="0"/>
           <w:sz w:val="21"/>
         </w:rPr>
-        <w:t>Bilan annuel : combien de signalements, sur quels sites, quels délais de réaction, quelles suites. Ce bilan alimente le document unique et la consultation du comité.</w:t>
+        <w:t>Bilan annuel : combien de signalements, sur quels sites, quels délais de réaction, quelles suites. Ce bilan alimente le document unique (action 1) et la consultation du comité.</w:t>
       </w:r>
     </w:p>
     <w:p>
       <w:pPr>
-        <w:spacing w:after="80"/>
-      </w:pPr>
-      <w:r>
-        <w:rPr>
-          <w:b/>
-          <w:sz w:val="20"/>
-        </w:rPr>
-        <w:t xml:space="preserve">Pièces à conserver : </w:t>
-      </w:r>
-      <w:r>
-        <w:rPr>
-          <w:color w:val="555555"/>
-          <w:sz w:val="20"/>
-        </w:rPr>
-        <w:t>Registre tenu · Bilan annuel · Politique de conservation et d’accès</w:t>
-      </w:r>
-    </w:p>
-    <w:p>
-      <w:pPr>
-        <w:spacing w:before="320" w:after="80"/>
+        <w:spacing w:before="240" w:after="80"/>
       </w:pPr>
       <w:r>
         <w:rPr>
@@ -5714,19 +6880,82 @@
           <w:color w:val="1F3B57"/>
           <w:sz w:val="25"/>
         </w:rPr>
-        <w:t>9 · Réagir : le protocole, dans l’ordre</w:t>
+        <w:t>Ce que l’action produit — les pièces à conserver</w:t>
       </w:r>
     </w:p>
     <w:p>
       <w:pPr>
-        <w:spacing w:before="0" w:after="100"/>
+        <w:pStyle w:val="ListBullet"/>
+        <w:spacing w:after="40"/>
+      </w:pPr>
+      <w:r>
+        <w:rPr>
+          <w:sz w:val="20"/>
+        </w:rPr>
+        <w:t>Registre tenu</w:t>
+      </w:r>
+    </w:p>
+    <w:p>
+      <w:pPr>
+        <w:pStyle w:val="ListBullet"/>
+        <w:spacing w:after="40"/>
+      </w:pPr>
+      <w:r>
+        <w:rPr>
+          <w:sz w:val="20"/>
+        </w:rPr>
+        <w:t>Bilan annuel</w:t>
+      </w:r>
+    </w:p>
+    <w:p>
+      <w:pPr>
+        <w:pStyle w:val="ListBullet"/>
+        <w:spacing w:after="40"/>
+      </w:pPr>
+      <w:r>
+        <w:rPr>
+          <w:sz w:val="20"/>
+        </w:rPr>
+        <w:t>Politique de conservation et d’accès</w:t>
+      </w:r>
+    </w:p>
+    <w:p>
+      <w:r>
+        <w:br w:type="page"/>
+      </w:r>
+    </w:p>
+    <w:p>
+      <w:pPr>
+        <w:spacing w:before="0" w:after="80"/>
+      </w:pPr>
+      <w:r>
+        <w:rPr>
+          <w:b/>
+          <w:i w:val="0"/>
+          <w:color w:val="1F3B57"/>
+          <w:sz w:val="32"/>
+        </w:rPr>
+        <w:t>Action 12 — Réagir : le protocole, dans l’ordre</w:t>
+      </w:r>
+    </w:p>
+    <w:p>
+      <w:pPr>
+        <w:spacing w:after="160"/>
+        <w:pBdr>
+          <w:bottom w:val="single" w:sz="8" w:color="C9A84C"/>
+        </w:pBdr>
+      </w:pPr>
+    </w:p>
+    <w:p>
+      <w:pPr>
+        <w:spacing w:before="0" w:after="160"/>
       </w:pPr>
       <w:r>
         <w:rPr>
           <w:b w:val="0"/>
           <w:i/>
           <w:color w:val="A0842E"/>
-          <w:sz w:val="19"/>
+          <w:sz w:val="20"/>
         </w:rPr>
         <w:t>Articles L.1152-2 à L.1152-4</w:t>
       </w:r>
@@ -5811,21 +7040,89 @@
     </w:p>
     <w:p>
       <w:pPr>
-        <w:spacing w:after="80"/>
+        <w:spacing w:before="0" w:after="100"/>
+      </w:pPr>
+      <w:r>
+        <w:rPr>
+          <w:b w:val="0"/>
+          <w:i w:val="0"/>
+          <w:sz w:val="21"/>
+        </w:rPr>
+        <w:t>Cette action est la seule des douze qui ne se prépare pas : elle s’exécute. Les onze autres existent pour qu’elle soit tenable dans les délais.</w:t>
+      </w:r>
+    </w:p>
+    <w:p>
+      <w:pPr>
+        <w:spacing w:before="240" w:after="80"/>
       </w:pPr>
       <w:r>
         <w:rPr>
           <w:b/>
+          <w:i w:val="0"/>
+          <w:color w:val="1F3B57"/>
+          <w:sz w:val="25"/>
+        </w:rPr>
+        <w:t>Ce que l’action produit — les pièces à conserver</w:t>
+      </w:r>
+    </w:p>
+    <w:p>
+      <w:pPr>
+        <w:pStyle w:val="ListBullet"/>
+        <w:spacing w:after="40"/>
+      </w:pPr>
+      <w:r>
+        <w:rPr>
           <w:sz w:val="20"/>
         </w:rPr>
-        <w:t xml:space="preserve">Pièces à conserver : </w:t>
+        <w:t>Accusé de réception</w:t>
       </w:r>
+    </w:p>
+    <w:p>
+      <w:pPr>
+        <w:pStyle w:val="ListBullet"/>
+        <w:spacing w:after="40"/>
+      </w:pPr>
       <w:r>
         <w:rPr>
-          <w:color w:val="555555"/>
           <w:sz w:val="20"/>
         </w:rPr>
-        <w:t>Accusé de réception · Comptes rendus d’audition signés · Rapport d’enquête · Décision motivée notifiée · Compte rendu de suivi à trois mois</w:t>
+        <w:t>Comptes rendus d’audition signés</w:t>
+      </w:r>
+    </w:p>
+    <w:p>
+      <w:pPr>
+        <w:pStyle w:val="ListBullet"/>
+        <w:spacing w:after="40"/>
+      </w:pPr>
+      <w:r>
+        <w:rPr>
+          <w:sz w:val="20"/>
+        </w:rPr>
+        <w:t>Rapport d’enquête</w:t>
+      </w:r>
+    </w:p>
+    <w:p>
+      <w:pPr>
+        <w:pStyle w:val="ListBullet"/>
+        <w:spacing w:after="40"/>
+      </w:pPr>
+      <w:r>
+        <w:rPr>
+          <w:sz w:val="20"/>
+        </w:rPr>
+        <w:t>Décision motivée notifiée</w:t>
+      </w:r>
+    </w:p>
+    <w:p>
+      <w:pPr>
+        <w:pStyle w:val="ListBullet"/>
+        <w:spacing w:after="40"/>
+      </w:pPr>
+      <w:r>
+        <w:rPr>
+          <w:sz w:val="20"/>
+        </w:rPr>
+        <w:t>Compte rendu de suivi à trois mois</w:t>
       </w:r>
     </w:p>
     <w:p>
@@ -5854,6 +7151,20 @@
           <w:bottom w:val="single" w:sz="8" w:color="C9A84C"/>
         </w:pBdr>
       </w:pPr>
+    </w:p>
+    <w:p>
+      <w:pPr>
+        <w:spacing w:before="0" w:after="160"/>
+      </w:pPr>
+      <w:r>
+        <w:rPr>
+          <w:b w:val="0"/>
+          <w:i/>
+          <w:color w:val="555555"/>
+          <w:sz w:val="20"/>
+        </w:rPr>
+        <w:t>Le numéro entre parenthèses renvoie à l’action.</w:t>
+      </w:r>
     </w:p>
     <w:tbl>
       <w:tblPr>
@@ -5921,7 +7232,7 @@
               <w:rPr>
                 <w:sz w:val="19"/>
               </w:rPr>
-              <w:t>Diagnostic des douze points. Désignation des référents si elle manque. Ouverture du registre.</w:t>
+              <w:t>Diagnostic des douze actions. Désignation des référents si elle manque (4, 5). Ouverture du registre (11).</w:t>
             </w:r>
           </w:p>
         </w:tc>
@@ -5950,7 +7261,7 @@
               <w:rPr>
                 <w:sz w:val="19"/>
               </w:rPr>
-              <w:t>Écriture de la procédure de signalement. Mise à jour du règlement intérieur, consultation du comité.</w:t>
+              <w:t>Écriture de la procédure de signalement (6). Mise à jour du règlement intérieur, consultation du comité (3).</w:t>
             </w:r>
           </w:p>
         </w:tc>
@@ -5979,7 +7290,7 @@
               <w:rPr>
                 <w:sz w:val="19"/>
               </w:rPr>
-              <w:t>Formation des référents — deux jours.</w:t>
+              <w:t>Formation des référents — deux jours (8).</w:t>
             </w:r>
           </w:p>
         </w:tc>
@@ -6008,7 +7319,7 @@
               <w:rPr>
                 <w:sz w:val="19"/>
               </w:rPr>
-              <w:t>Affichage mis en place sur tous les sites, photographies datées.</w:t>
+              <w:t>Affichage mis en place sur tous les sites, photographies datées (2).</w:t>
             </w:r>
           </w:p>
         </w:tc>
@@ -6037,7 +7348,7 @@
               <w:rPr>
                 <w:sz w:val="19"/>
               </w:rPr>
-              <w:t>Formation de l’encadrement — une journée par session de douze à quinze.</w:t>
+              <w:t>Formation de l’encadrement — une journée par session de douze à quinze (7).</w:t>
             </w:r>
           </w:p>
         </w:tc>
@@ -6066,7 +7377,7 @@
               <w:rPr>
                 <w:sz w:val="19"/>
               </w:rPr>
-              <w:t>Mise à jour du document unique, volet risques psychosociaux, avec consultation du comité.</w:t>
+              <w:t>Mise à jour du document unique, volet risques psychosociaux, avec consultation du comité (1).</w:t>
             </w:r>
           </w:p>
         </w:tc>
@@ -6095,7 +7406,7 @@
               <w:rPr>
                 <w:sz w:val="19"/>
               </w:rPr>
-              <w:t>Information de l’ensemble des salariés — une heure trente par groupe.</w:t>
+              <w:t>Information de l’ensemble des salariés — une heure trente par groupe (9).</w:t>
             </w:r>
           </w:p>
         </w:tc>
@@ -6124,7 +7435,7 @@
               <w:rPr>
                 <w:sz w:val="19"/>
               </w:rPr>
-              <w:t>Intégration de la notice au livret d’accueil ; premier contrôle mensuel des entrants.</w:t>
+              <w:t>Intégration de la notice au livret d’accueil ; premier contrôle mensuel des entrants (10).</w:t>
             </w:r>
           </w:p>
         </w:tc>
@@ -6153,7 +7464,7 @@
               <w:rPr>
                 <w:sz w:val="19"/>
               </w:rPr>
-              <w:t>Dépôt du règlement intérieur au greffe, transmission à l’inspection du travail.</w:t>
+              <w:t>Dépôt du règlement intérieur au greffe, transmission à l’inspection du travail (3).</w:t>
             </w:r>
           </w:p>
         </w:tc>
@@ -6182,7 +7493,7 @@
               <w:rPr>
                 <w:sz w:val="19"/>
               </w:rPr>
-              <w:t>Bilan annuel du registre. Consultation du comité. Édition du dossier de preuve.</w:t>
+              <w:t>Bilan annuel du registre (11). Consultation du comité. Édition du dossier de preuve.</w:t>
             </w:r>
           </w:p>
         </w:tc>
@@ -6211,7 +7522,7 @@
               <w:rPr>
                 <w:sz w:val="19"/>
               </w:rPr>
-              <w:t>Rappel de deux heures pour l’encadrement tous les deux ans. Information annuelle pour tous. Contrôle semestriel de l’affichage. Mise à jour annuelle du document unique.</w:t>
+              <w:t>Rappel de deux heures pour l’encadrement tous les deux ans (7). Information annuelle pour tous (9). Contrôle semestriel de l’affichage (2). Mise à jour annuelle du document unique (1). L’action 12 s’applique à chaque signalement, sans calendrier.</w:t>
             </w:r>
           </w:p>
         </w:tc>
@@ -6228,7 +7539,7 @@
           <w:color w:val="555555"/>
           <w:sz w:val="19"/>
         </w:rPr>
-        <w:t>Ce calendrier n’est pas une contrainte réglementaire : c’est l’ordre dans lequel les actions se tiennent le mieux. Ce qui compte devant le juge, c’est que chacune soit datée et prouvée.</w:t>
+        <w:t>Ce calendrier n’est pas une contrainte réglementaire : c’est l’ordre dans lequel les actions se tiennent le mieux. Ce qui compte devant le juge, c’est que chacune des douze soit datée et prouvée.</w:t>
       </w:r>
     </w:p>
     <w:sectPr>

</xml_diff>

<commit_message>
Action 1 : ce qu'on ecrit precisement dans le document unique, avec un exemple rempli
</commit_message>
<xml_diff>
--- a/exemples/PROGRAMMES_PREVENTION_HARCELEMENT.docx
+++ b/exemples/PROGRAMMES_PREVENTION_HARCELEMENT.docx
@@ -1130,7 +1130,7 @@
           <w:color w:val="A0842E"/>
           <w:sz w:val="20"/>
         </w:rPr>
-        <w:t>Article L.4121-3 et article R.4121-1</w:t>
+        <w:t>Articles L.4121-3, L.4121-3-1, R.4121-1, R.4121-2 et R.4121-4</w:t>
       </w:r>
     </w:p>
     <w:p>
@@ -1143,46 +1143,7 @@
           <w:i w:val="0"/>
           <w:sz w:val="21"/>
         </w:rPr>
-        <w:t>Le harcèlement n’est pas un incident relationnel : c’est un risque professionnel, au même titre que le bruit ou la manutention. Il s’évalue unité de travail par unité de travail.</w:t>
-      </w:r>
-    </w:p>
-    <w:p>
-      <w:pPr>
-        <w:spacing w:before="0" w:after="100"/>
-      </w:pPr>
-      <w:r>
-        <w:rPr>
-          <w:b w:val="0"/>
-          <w:i w:val="0"/>
-          <w:sz w:val="21"/>
-        </w:rPr>
-        <w:t>Situations à examiner en priorité : travail isolé, relation client difficile, forte pression sur les résultats, réorganisation en cours, encadrement récemment nommé, équipes en sous-effectif.</w:t>
-      </w:r>
-    </w:p>
-    <w:p>
-      <w:pPr>
-        <w:spacing w:before="0" w:after="100"/>
-      </w:pPr>
-      <w:r>
-        <w:rPr>
-          <w:b w:val="0"/>
-          <w:i w:val="0"/>
-          <w:sz w:val="21"/>
-        </w:rPr>
-        <w:t>Pour chaque unité : la situation dangereuse, la gravité, la fréquence, les mesures existantes et les mesures décidées — avec un responsable et une date. Une cotation sans mesure décidée ne sert à rien.</w:t>
-      </w:r>
-    </w:p>
-    <w:p>
-      <w:pPr>
-        <w:spacing w:before="0" w:after="100"/>
-      </w:pPr>
-      <w:r>
-        <w:rPr>
-          <w:b w:val="0"/>
-          <w:i w:val="0"/>
-          <w:sz w:val="21"/>
-        </w:rPr>
-        <w:t>Mise à jour au moins annuelle, et à chaque signalement : un signalement EST une information supplémentaire sur un risque.</w:t>
+        <w:t>Le harcèlement n’est pas un incident relationnel : c’est un risque professionnel, au même titre que le bruit ou la manutention. Il s’évalue unité de travail par unité de travail, et il s’écrit.</w:t>
       </w:r>
     </w:p>
     <w:p>
@@ -1196,7 +1157,86 @@
           <w:color w:val="1F3B57"/>
           <w:sz w:val="25"/>
         </w:rPr>
-        <w:t>Ce que l’action produit — les pièces à conserver</w:t>
+        <w:t>Ce que le code exige — et ce qu’il n’exige pas</w:t>
+      </w:r>
+    </w:p>
+    <w:p>
+      <w:pPr>
+        <w:spacing w:before="0" w:after="100"/>
+      </w:pPr>
+      <w:r>
+        <w:rPr>
+          <w:b w:val="0"/>
+          <w:i w:val="0"/>
+          <w:sz w:val="21"/>
+        </w:rPr>
+        <w:t>L’article R.4121-1 impose de transcrire dans un document unique « les résultats de l’évaluation des risques pour la santé et la sécurité des travailleurs », évaluation qui comporte un inventaire des risques identifiés dans chaque unité de travail.</w:t>
+      </w:r>
+    </w:p>
+    <w:p>
+      <w:pPr>
+        <w:spacing w:before="0" w:after="100"/>
+      </w:pPr>
+      <w:r>
+        <w:rPr>
+          <w:b w:val="0"/>
+          <w:i w:val="0"/>
+          <w:sz w:val="21"/>
+        </w:rPr>
+        <w:t>L’article L.4121-3-1 ajoute ce que les résultats doivent produire : dans les entreprises d’au moins cinquante salariés, un programme annuel de prévention des risques professionnels et d’amélioration des conditions de travail, qui fixe la liste détaillée des mesures à prendre dans l’année, et pour chacune ses conditions d’exécution, un indicateur de résultat et une estimation de son coût. Dans les entreprises de moins de cinquante salariés, une liste d’actions, intégrée au document unique lui-même. Le document et ses mises à jour se conservent quarante ans.</w:t>
+      </w:r>
+    </w:p>
+    <w:p>
+      <w:pPr>
+        <w:spacing w:before="0" w:after="100"/>
+      </w:pPr>
+      <w:r>
+        <w:rPr>
+          <w:b/>
+          <w:i w:val="0"/>
+          <w:sz w:val="21"/>
+        </w:rPr>
+        <w:t>Ce que le code n’impose pas : aucune trame, aucune grille de cotation, aucun logiciel. La gravité sur quatre niveaux utilisée dans l’exemple ci-dessous est une convention répandue, pas une règle. Ce qui est exigé, c’est que le risque soit identifié par unité de travail et que des mesures en découlent.</w:t>
+      </w:r>
+    </w:p>
+    <w:p>
+      <w:pPr>
+        <w:spacing w:before="280" w:after="80"/>
+      </w:pPr>
+      <w:r>
+        <w:rPr>
+          <w:b/>
+          <w:i w:val="0"/>
+          <w:color w:val="1F3B57"/>
+          <w:sz w:val="25"/>
+        </w:rPr>
+        <w:t>1. Découper l’entreprise en unités de travail</w:t>
+      </w:r>
+    </w:p>
+    <w:p>
+      <w:pPr>
+        <w:spacing w:before="0" w:after="100"/>
+      </w:pPr>
+      <w:r>
+        <w:rPr>
+          <w:b w:val="0"/>
+          <w:i w:val="0"/>
+          <w:sz w:val="21"/>
+        </w:rPr>
+        <w:t>Une unité de travail n’est pas forcément un service de l’organigramme : c’est un groupe de salariés exposés aux mêmes conditions. Un même intitulé de poste peut relever de deux unités différentes selon le site ou l’équipe.</w:t>
+      </w:r>
+    </w:p>
+    <w:p>
+      <w:pPr>
+        <w:spacing w:before="0" w:after="80"/>
+      </w:pPr>
+      <w:r>
+        <w:rPr>
+          <w:b w:val="0"/>
+          <w:i w:val="0"/>
+          <w:sz w:val="21"/>
+        </w:rPr>
+        <w:t>Pour le risque de harcèlement, à examiner en priorité :</w:t>
       </w:r>
     </w:p>
     <w:p>
@@ -1208,7 +1248,7 @@
         <w:rPr>
           <w:sz w:val="20"/>
         </w:rPr>
-        <w:t>Document unique daté, volet risques psychosociaux</w:t>
+        <w:t>Les équipes où le travail est isolé, ou en horaires décalés.</w:t>
       </w:r>
     </w:p>
     <w:p>
@@ -1220,7 +1260,7 @@
         <w:rPr>
           <w:sz w:val="20"/>
         </w:rPr>
-        <w:t>Procès-verbal de consultation du comité</w:t>
+        <w:t>Celles exposées à une forte pression sur les résultats, ou à des objectifs individuels affichés.</w:t>
       </w:r>
     </w:p>
     <w:p>
@@ -1232,7 +1272,929 @@
         <w:rPr>
           <w:sz w:val="20"/>
         </w:rPr>
-        <w:t>Plan d’actions avec responsable et échéance</w:t>
+        <w:t>Celles en réorganisation, en sous-effectif, ou dont l’encadrement vient d’être nommé.</w:t>
+      </w:r>
+    </w:p>
+    <w:p>
+      <w:pPr>
+        <w:pStyle w:val="ListBullet"/>
+        <w:spacing w:after="40"/>
+      </w:pPr>
+      <w:r>
+        <w:rPr>
+          <w:sz w:val="20"/>
+        </w:rPr>
+        <w:t>Celles où une plainte, un arrêt long, une inaptitude ou un départ conflictuel est déjà survenu.</w:t>
+      </w:r>
+    </w:p>
+    <w:p>
+      <w:pPr>
+        <w:pStyle w:val="ListBullet"/>
+        <w:spacing w:after="40"/>
+      </w:pPr>
+      <w:r>
+        <w:rPr>
+          <w:sz w:val="20"/>
+        </w:rPr>
+        <w:t>Celles dont le travail expose à des tiers : clients, patients, usagers, sous-traitants.</w:t>
+      </w:r>
+    </w:p>
+    <w:p>
+      <w:pPr>
+        <w:spacing w:before="280" w:after="80"/>
+      </w:pPr>
+      <w:r>
+        <w:rPr>
+          <w:b/>
+          <w:i w:val="0"/>
+          <w:color w:val="1F3B57"/>
+          <w:sz w:val="25"/>
+        </w:rPr>
+        <w:t>2. Nommer le risque, dans les mots du document unique</w:t>
+      </w:r>
+    </w:p>
+    <w:p>
+      <w:pPr>
+        <w:spacing w:before="0" w:after="100"/>
+      </w:pPr>
+      <w:r>
+        <w:rPr>
+          <w:b w:val="0"/>
+          <w:i w:val="0"/>
+          <w:sz w:val="21"/>
+        </w:rPr>
+        <w:t>Écrire « ambiance tendue » ou « conflit interpersonnel » ne vaut rien : ce n’est pas un risque, c’est un commentaire. Le risque se nomme comme un danger, avec son effet possible.</w:t>
+      </w:r>
+    </w:p>
+    <w:p>
+      <w:pPr>
+        <w:spacing w:before="0" w:after="100"/>
+      </w:pPr>
+      <w:r>
+        <w:rPr>
+          <w:b/>
+          <w:i w:val="0"/>
+          <w:sz w:val="21"/>
+        </w:rPr>
+        <w:t>Formulation à reprendre : « Risque d’atteinte à la santé mentale lié aux rapports sociaux de travail — harcèlement moral, harcèlement sexuel, agissements sexistes ». Ce libellé reprend le vocabulaire de l’article L.4121-2, 7°, qui vise expressément ces trois risques.</w:t>
+      </w:r>
+    </w:p>
+    <w:p>
+      <w:pPr>
+        <w:spacing w:before="280" w:after="80"/>
+      </w:pPr>
+      <w:r>
+        <w:rPr>
+          <w:b/>
+          <w:i w:val="0"/>
+          <w:color w:val="1F3B57"/>
+          <w:sz w:val="25"/>
+        </w:rPr>
+        <w:t>3. Ce qu’on écrit, ligne par ligne</w:t>
+      </w:r>
+    </w:p>
+    <w:p>
+      <w:pPr>
+        <w:spacing w:before="0" w:after="100"/>
+      </w:pPr>
+      <w:r>
+        <w:rPr>
+          <w:b w:val="0"/>
+          <w:i w:val="0"/>
+          <w:sz w:val="21"/>
+        </w:rPr>
+        <w:t>Une ligne du document unique se remplit dans cet ordre. Aucune de ces rubriques n’est imposée par le code, mais l’absence de l’une d’elles est ce qu’un inspecteur, un expert ou un juge relève en premier.</w:t>
+      </w:r>
+    </w:p>
+    <w:p>
+      <w:pPr>
+        <w:pStyle w:val="ListBullet"/>
+        <w:spacing w:after="40"/>
+      </w:pPr>
+      <w:r>
+        <w:rPr>
+          <w:sz w:val="20"/>
+        </w:rPr>
+        <w:t>L’unité de travail, nommée, avec son effectif et son site.</w:t>
+      </w:r>
+    </w:p>
+    <w:p>
+      <w:pPr>
+        <w:pStyle w:val="ListBullet"/>
+        <w:spacing w:after="40"/>
+      </w:pPr>
+      <w:r>
+        <w:rPr>
+          <w:sz w:val="20"/>
+        </w:rPr>
+        <w:t>Le risque, dans les mots du 2 ci-dessus.</w:t>
+      </w:r>
+    </w:p>
+    <w:p>
+      <w:pPr>
+        <w:pStyle w:val="ListBullet"/>
+        <w:spacing w:after="40"/>
+      </w:pPr>
+      <w:r>
+        <w:rPr>
+          <w:sz w:val="20"/>
+        </w:rPr>
+        <w:t>La situation dangereuse : ce qui se passe réellement, décrit en faits observables. C’est la rubrique que tout le monde bâcle, et la seule qui prouve que l’évaluation a eu lieu.</w:t>
+      </w:r>
+    </w:p>
+    <w:p>
+      <w:pPr>
+        <w:pStyle w:val="ListBullet"/>
+        <w:spacing w:after="40"/>
+      </w:pPr>
+      <w:r>
+        <w:rPr>
+          <w:sz w:val="20"/>
+        </w:rPr>
+        <w:t>La population exposée : combien, et qui — y compris les contrats courts et les intérimaires.</w:t>
+      </w:r>
+    </w:p>
+    <w:p>
+      <w:pPr>
+        <w:pStyle w:val="ListBullet"/>
+        <w:spacing w:after="40"/>
+      </w:pPr>
+      <w:r>
+        <w:rPr>
+          <w:sz w:val="20"/>
+        </w:rPr>
+        <w:t>Les mesures déjà en place, avec leur date.</w:t>
+      </w:r>
+    </w:p>
+    <w:p>
+      <w:pPr>
+        <w:pStyle w:val="ListBullet"/>
+        <w:spacing w:after="40"/>
+      </w:pPr>
+      <w:r>
+        <w:rPr>
+          <w:sz w:val="20"/>
+        </w:rPr>
+        <w:t>La gravité et la fréquence, selon l’échelle que vous aurez retenue et écrite une fois pour toutes en tête de document.</w:t>
+      </w:r>
+    </w:p>
+    <w:p>
+      <w:pPr>
+        <w:pStyle w:val="ListBullet"/>
+        <w:spacing w:after="40"/>
+      </w:pPr>
+      <w:r>
+        <w:rPr>
+          <w:sz w:val="20"/>
+        </w:rPr>
+        <w:t>Le niveau de priorité qui en résulte.</w:t>
+      </w:r>
+    </w:p>
+    <w:p>
+      <w:pPr>
+        <w:pStyle w:val="ListBullet"/>
+        <w:spacing w:after="40"/>
+      </w:pPr>
+      <w:r>
+        <w:rPr>
+          <w:sz w:val="20"/>
+        </w:rPr>
+        <w:t>Les mesures décidées, un responsable nommé, une échéance datée.</w:t>
+      </w:r>
+    </w:p>
+    <w:p>
+      <w:pPr>
+        <w:pStyle w:val="ListBullet"/>
+        <w:spacing w:after="40"/>
+      </w:pPr>
+      <w:r>
+        <w:rPr>
+          <w:sz w:val="20"/>
+        </w:rPr>
+        <w:t>L’indicateur qui dira si la mesure a produit un effet, et le coût estimé (obligatoire à partir de cinquante salariés, article L.4121-3-1).</w:t>
+      </w:r>
+    </w:p>
+    <w:p>
+      <w:pPr>
+        <w:spacing w:before="0" w:after="100"/>
+      </w:pPr>
+      <w:r>
+        <w:rPr>
+          <w:b/>
+          <w:i w:val="0"/>
+          <w:sz w:val="21"/>
+        </w:rPr>
+        <w:t>Une cotation sans mesure décidée ne sert à rien : elle établit que l’employeur connaissait le risque et n’a rien fait. C’est la seule manière de transformer le document unique en pièce à charge.</w:t>
+      </w:r>
+    </w:p>
+    <w:p>
+      <w:pPr>
+        <w:spacing w:before="280" w:after="80"/>
+      </w:pPr>
+      <w:r>
+        <w:rPr>
+          <w:b/>
+          <w:i w:val="0"/>
+          <w:color w:val="1F3B57"/>
+          <w:sz w:val="25"/>
+        </w:rPr>
+        <w:t>4. Exemple rempli — plateau de recouvrement, 18 salariés</w:t>
+      </w:r>
+    </w:p>
+    <w:p>
+      <w:pPr>
+        <w:spacing w:before="0" w:after="120"/>
+      </w:pPr>
+      <w:r>
+        <w:rPr>
+          <w:b w:val="0"/>
+          <w:i/>
+          <w:color w:val="B23B3B"/>
+          <w:sz w:val="19"/>
+        </w:rPr>
+        <w:t>Exemple pédagogique. L’entreprise, les faits et les chiffres sont fictifs. Il montre le niveau de précision attendu : il ne se recopie pas. Un document unique recopié d’un modèle est un document unique non fait.</w:t>
+      </w:r>
+    </w:p>
+    <w:tbl>
+      <w:tblPr>
+        <w:tblStyle w:val="TableGrid"/>
+        <w:tblW w:type="auto" w:w="0"/>
+        <w:tblLook w:firstColumn="1" w:firstRow="1" w:lastColumn="0" w:lastRow="0" w:noHBand="0" w:noVBand="1" w:val="04A0"/>
+      </w:tblPr>
+      <w:tblGrid>
+        <w:gridCol w:w="2381"/>
+        <w:gridCol w:w="6803"/>
+      </w:tblGrid>
+      <w:tr>
+        <w:tc>
+          <w:tcPr>
+            <w:tcW w:type="dxa" w:w="4873"/>
+          </w:tcPr>
+          <w:p>
+            <w:r>
+              <w:rPr>
+                <w:b/>
+                <w:sz w:val="18"/>
+              </w:rPr>
+              <w:t>Unité de travail</w:t>
+            </w:r>
+          </w:p>
+        </w:tc>
+        <w:tc>
+          <w:tcPr>
+            <w:tcW w:type="dxa" w:w="4873"/>
+          </w:tcPr>
+          <w:p>
+            <w:r>
+              <w:rPr>
+                <w:b w:val="0"/>
+                <w:sz w:val="18"/>
+              </w:rPr>
+              <w:t>Plateau « recouvrement amiable » — site de Lyon — 18 salariés : 14 chargés de recouvrement (dont 6 en CDD), 3 superviseurs, 1 responsable de plateau.</w:t>
+            </w:r>
+          </w:p>
+        </w:tc>
+      </w:tr>
+      <w:tr>
+        <w:tc>
+          <w:tcPr>
+            <w:tcW w:type="dxa" w:w="4873"/>
+          </w:tcPr>
+          <w:p>
+            <w:r>
+              <w:rPr>
+                <w:b/>
+                <w:sz w:val="18"/>
+              </w:rPr>
+              <w:t>Risque identifié</w:t>
+            </w:r>
+          </w:p>
+        </w:tc>
+        <w:tc>
+          <w:tcPr>
+            <w:tcW w:type="dxa" w:w="4873"/>
+          </w:tcPr>
+          <w:p>
+            <w:r>
+              <w:rPr>
+                <w:b w:val="0"/>
+                <w:sz w:val="18"/>
+              </w:rPr>
+              <w:t>Risque d’atteinte à la santé mentale lié aux rapports sociaux de travail — harcèlement moral (L.4121-2, 7°).</w:t>
+            </w:r>
+          </w:p>
+        </w:tc>
+      </w:tr>
+      <w:tr>
+        <w:tc>
+          <w:tcPr>
+            <w:tcW w:type="dxa" w:w="4873"/>
+          </w:tcPr>
+          <w:p>
+            <w:r>
+              <w:rPr>
+                <w:b/>
+                <w:sz w:val="18"/>
+              </w:rPr>
+              <w:t>Situation dangereuse</w:t>
+              <w:br/>
+            </w:r>
+            <w:r>
+              <w:rPr>
+                <w:b/>
+                <w:sz w:val="18"/>
+              </w:rPr>
+              <w:t>(faits observables)</w:t>
+            </w:r>
+          </w:p>
+        </w:tc>
+        <w:tc>
+          <w:tcPr>
+            <w:tcW w:type="dxa" w:w="4873"/>
+          </w:tcPr>
+          <w:p>
+            <w:r>
+              <w:rPr>
+                <w:b w:val="0"/>
+                <w:sz w:val="18"/>
+              </w:rPr>
+              <w:t>Affichage nominatif quotidien du classement des chargés de recouvrement sur l’écran commun du plateau. Entretiens de recadrage tenus en espace ouvert, à portée de voix de l’équipe. Objectifs individuels relevés trois fois en six mois sans révision de l’effectif. Deux départs non remplacés depuis mars. Encadrement du plateau nommé en janvier, sans formation.</w:t>
+            </w:r>
+          </w:p>
+        </w:tc>
+      </w:tr>
+      <w:tr>
+        <w:tc>
+          <w:tcPr>
+            <w:tcW w:type="dxa" w:w="4873"/>
+          </w:tcPr>
+          <w:p>
+            <w:r>
+              <w:rPr>
+                <w:b/>
+                <w:sz w:val="18"/>
+              </w:rPr>
+              <w:t>Population exposée</w:t>
+            </w:r>
+          </w:p>
+        </w:tc>
+        <w:tc>
+          <w:tcPr>
+            <w:tcW w:type="dxa" w:w="4873"/>
+          </w:tcPr>
+          <w:p>
+            <w:r>
+              <w:rPr>
+                <w:b w:val="0"/>
+                <w:sz w:val="18"/>
+              </w:rPr>
+              <w:t>14 chargés de recouvrement, dont 6 en CDD et 2 intérimaires. Les 3 superviseurs sont exposés à double titre : comme cibles et comme auteurs possibles.</w:t>
+            </w:r>
+          </w:p>
+        </w:tc>
+      </w:tr>
+      <w:tr>
+        <w:tc>
+          <w:tcPr>
+            <w:tcW w:type="dxa" w:w="4873"/>
+          </w:tcPr>
+          <w:p>
+            <w:r>
+              <w:rPr>
+                <w:b/>
+                <w:sz w:val="18"/>
+              </w:rPr>
+              <w:t>Mesures déjà en place</w:t>
+            </w:r>
+          </w:p>
+        </w:tc>
+        <w:tc>
+          <w:tcPr>
+            <w:tcW w:type="dxa" w:w="4873"/>
+          </w:tcPr>
+          <w:p>
+            <w:r>
+              <w:rPr>
+                <w:b w:val="0"/>
+                <w:sz w:val="18"/>
+              </w:rPr>
+              <w:t>Affichage L.1152-4 à jour (photographié le 14 mai). Référent du comité désigné (PV du 12 février). Procédure de signalement diffusée le 3 mars, accusé de lecture pour 16 salariés sur 18.</w:t>
+            </w:r>
+          </w:p>
+        </w:tc>
+      </w:tr>
+      <w:tr>
+        <w:tc>
+          <w:tcPr>
+            <w:tcW w:type="dxa" w:w="4873"/>
+          </w:tcPr>
+          <w:p>
+            <w:r>
+              <w:rPr>
+                <w:b/>
+                <w:sz w:val="18"/>
+              </w:rPr>
+              <w:t>Gravité</w:t>
+            </w:r>
+          </w:p>
+        </w:tc>
+        <w:tc>
+          <w:tcPr>
+            <w:tcW w:type="dxa" w:w="4873"/>
+          </w:tcPr>
+          <w:p>
+            <w:r>
+              <w:rPr>
+                <w:b w:val="0"/>
+                <w:sz w:val="18"/>
+              </w:rPr>
+              <w:t>3 sur 4 — atteinte possible à la santé mentale, arrêt de travail envisageable.</w:t>
+            </w:r>
+          </w:p>
+        </w:tc>
+      </w:tr>
+      <w:tr>
+        <w:tc>
+          <w:tcPr>
+            <w:tcW w:type="dxa" w:w="4873"/>
+          </w:tcPr>
+          <w:p>
+            <w:r>
+              <w:rPr>
+                <w:b/>
+                <w:sz w:val="18"/>
+              </w:rPr>
+              <w:t>Fréquence d’exposition</w:t>
+            </w:r>
+          </w:p>
+        </w:tc>
+        <w:tc>
+          <w:tcPr>
+            <w:tcW w:type="dxa" w:w="4873"/>
+          </w:tcPr>
+          <w:p>
+            <w:r>
+              <w:rPr>
+                <w:b w:val="0"/>
+                <w:sz w:val="18"/>
+              </w:rPr>
+              <w:t>4 sur 4 — quotidienne.</w:t>
+            </w:r>
+          </w:p>
+        </w:tc>
+      </w:tr>
+      <w:tr>
+        <w:tc>
+          <w:tcPr>
+            <w:tcW w:type="dxa" w:w="4873"/>
+          </w:tcPr>
+          <w:p>
+            <w:r>
+              <w:rPr>
+                <w:b/>
+                <w:sz w:val="18"/>
+              </w:rPr>
+              <w:t>Priorité</w:t>
+            </w:r>
+          </w:p>
+        </w:tc>
+        <w:tc>
+          <w:tcPr>
+            <w:tcW w:type="dxa" w:w="4873"/>
+          </w:tcPr>
+          <w:p>
+            <w:r>
+              <w:rPr>
+                <w:b w:val="0"/>
+                <w:sz w:val="18"/>
+              </w:rPr>
+              <w:t>P1 — à traiter dans les trois mois.</w:t>
+            </w:r>
+          </w:p>
+        </w:tc>
+      </w:tr>
+      <w:tr>
+        <w:tc>
+          <w:tcPr>
+            <w:tcW w:type="dxa" w:w="4873"/>
+          </w:tcPr>
+          <w:p>
+            <w:r>
+              <w:rPr>
+                <w:b/>
+                <w:sz w:val="18"/>
+              </w:rPr>
+              <w:t>Mesures décidées</w:t>
+            </w:r>
+          </w:p>
+        </w:tc>
+        <w:tc>
+          <w:tcPr>
+            <w:tcW w:type="dxa" w:w="4873"/>
+          </w:tcPr>
+          <w:p>
+            <w:r>
+              <w:rPr>
+                <w:b w:val="0"/>
+                <w:sz w:val="18"/>
+              </w:rPr>
+              <w:t>1. Suppression de l’affichage nominatif des classements, remplacé par un indicateur collectif hebdomadaire.</w:t>
+              <w:br/>
+            </w:r>
+            <w:r>
+              <w:rPr>
+                <w:b w:val="0"/>
+                <w:sz w:val="18"/>
+              </w:rPr>
+              <w:t>2. Entretiens individuels tenus en salle fermée, sans exception.</w:t>
+              <w:br/>
+            </w:r>
+            <w:r>
+              <w:rPr>
+                <w:b w:val="0"/>
+                <w:sz w:val="18"/>
+              </w:rPr>
+              <w:t>3. Formation des 4 encadrants du plateau (action 7 du présent dossier).</w:t>
+              <w:br/>
+            </w:r>
+            <w:r>
+              <w:rPr>
+                <w:b w:val="0"/>
+                <w:sz w:val="18"/>
+              </w:rPr>
+              <w:t>4. Retour à l’effectif cible : 2 recrutements ouverts.</w:t>
+              <w:br/>
+            </w:r>
+            <w:r>
+              <w:rPr>
+                <w:b w:val="0"/>
+                <w:sz w:val="18"/>
+              </w:rPr>
+              <w:t>5. Point mensuel du responsable de site sur la charge et les objectifs, tracé par écrit.</w:t>
+            </w:r>
+          </w:p>
+        </w:tc>
+      </w:tr>
+      <w:tr>
+        <w:tc>
+          <w:tcPr>
+            <w:tcW w:type="dxa" w:w="4873"/>
+          </w:tcPr>
+          <w:p>
+            <w:r>
+              <w:rPr>
+                <w:b/>
+                <w:sz w:val="18"/>
+              </w:rPr>
+              <w:t>Responsable</w:t>
+            </w:r>
+          </w:p>
+        </w:tc>
+        <w:tc>
+          <w:tcPr>
+            <w:tcW w:type="dxa" w:w="4873"/>
+          </w:tcPr>
+          <w:p>
+            <w:r>
+              <w:rPr>
+                <w:b w:val="0"/>
+                <w:sz w:val="18"/>
+              </w:rPr>
+              <w:t>Directeur du site de Lyon, nommément désigné.</w:t>
+            </w:r>
+          </w:p>
+        </w:tc>
+      </w:tr>
+      <w:tr>
+        <w:tc>
+          <w:tcPr>
+            <w:tcW w:type="dxa" w:w="4873"/>
+          </w:tcPr>
+          <w:p>
+            <w:r>
+              <w:rPr>
+                <w:b/>
+                <w:sz w:val="18"/>
+              </w:rPr>
+              <w:t>Échéance</w:t>
+            </w:r>
+          </w:p>
+        </w:tc>
+        <w:tc>
+          <w:tcPr>
+            <w:tcW w:type="dxa" w:w="4873"/>
+          </w:tcPr>
+          <w:p>
+            <w:r>
+              <w:rPr>
+                <w:b w:val="0"/>
+                <w:sz w:val="18"/>
+              </w:rPr>
+              <w:t>30 septembre — revue le 31 décembre.</w:t>
+            </w:r>
+          </w:p>
+        </w:tc>
+      </w:tr>
+      <w:tr>
+        <w:tc>
+          <w:tcPr>
+            <w:tcW w:type="dxa" w:w="4873"/>
+          </w:tcPr>
+          <w:p>
+            <w:r>
+              <w:rPr>
+                <w:b/>
+                <w:sz w:val="18"/>
+              </w:rPr>
+              <w:t>Indicateur de résultat</w:t>
+            </w:r>
+          </w:p>
+        </w:tc>
+        <w:tc>
+          <w:tcPr>
+            <w:tcW w:type="dxa" w:w="4873"/>
+          </w:tcPr>
+          <w:p>
+            <w:r>
+              <w:rPr>
+                <w:b w:val="0"/>
+                <w:sz w:val="18"/>
+              </w:rPr>
+              <w:t>Nombre de signalements reçus sur le plateau. Taux d’absentéisme de l’unité. Réponse à l’item « je peux dire quand quelque chose ne va pas » du questionnaire annuel.</w:t>
+            </w:r>
+          </w:p>
+        </w:tc>
+      </w:tr>
+      <w:tr>
+        <w:tc>
+          <w:tcPr>
+            <w:tcW w:type="dxa" w:w="4873"/>
+          </w:tcPr>
+          <w:p>
+            <w:r>
+              <w:rPr>
+                <w:b/>
+                <w:sz w:val="18"/>
+              </w:rPr>
+              <w:t>Coût estimé</w:t>
+            </w:r>
+          </w:p>
+        </w:tc>
+        <w:tc>
+          <w:tcPr>
+            <w:tcW w:type="dxa" w:w="4873"/>
+          </w:tcPr>
+          <w:p>
+            <w:r>
+              <w:rPr>
+                <w:b w:val="0"/>
+                <w:sz w:val="18"/>
+              </w:rPr>
+              <w:t>4 encadrants × 1 journée de formation. Réaménagement de deux bureaux. 2 recrutements.</w:t>
+            </w:r>
+          </w:p>
+        </w:tc>
+      </w:tr>
+    </w:tbl>
+    <w:p>
+      <w:pPr>
+        <w:spacing w:before="280" w:after="80"/>
+      </w:pPr>
+      <w:r>
+        <w:rPr>
+          <w:b/>
+          <w:i w:val="0"/>
+          <w:color w:val="1F3B57"/>
+          <w:sz w:val="25"/>
+        </w:rPr>
+        <w:t>5. Ce qui ne doit PAS y figurer</w:t>
+      </w:r>
+    </w:p>
+    <w:p>
+      <w:pPr>
+        <w:spacing w:before="0" w:after="100"/>
+      </w:pPr>
+      <w:r>
+        <w:rPr>
+          <w:b w:val="0"/>
+          <w:i w:val="0"/>
+          <w:sz w:val="21"/>
+        </w:rPr>
+        <w:t>Le document unique est mis à la disposition des travailleurs, du comité, du médecin du travail et de l’inspection du travail (article R.4121-4). Il n’est donc jamais nominatif.</w:t>
+      </w:r>
+    </w:p>
+    <w:p>
+      <w:pPr>
+        <w:pStyle w:val="ListBullet"/>
+        <w:spacing w:after="40"/>
+      </w:pPr>
+      <w:r>
+        <w:rPr>
+          <w:sz w:val="20"/>
+        </w:rPr>
+        <w:t>Aucun nom de salarié, ni comme victime supposée, ni comme auteur supposé.</w:t>
+      </w:r>
+    </w:p>
+    <w:p>
+      <w:pPr>
+        <w:pStyle w:val="ListBullet"/>
+        <w:spacing w:after="40"/>
+      </w:pPr>
+      <w:r>
+        <w:rPr>
+          <w:sz w:val="20"/>
+        </w:rPr>
+        <w:t>Aucune donnée de santé : pas d’arrêt de travail nommé, pas de diagnostic, pas d’inaptitude rattachée à une personne.</w:t>
+      </w:r>
+    </w:p>
+    <w:p>
+      <w:pPr>
+        <w:pStyle w:val="ListBullet"/>
+        <w:spacing w:after="40"/>
+      </w:pPr>
+      <w:r>
+        <w:rPr>
+          <w:sz w:val="20"/>
+        </w:rPr>
+        <w:t>Aucun renvoi à un dossier en cours (« affaire du plateau, Mme …»). Le signalement se suit au registre, action 11.</w:t>
+      </w:r>
+    </w:p>
+    <w:p>
+      <w:pPr>
+        <w:pStyle w:val="ListBullet"/>
+        <w:spacing w:after="40"/>
+      </w:pPr>
+      <w:r>
+        <w:rPr>
+          <w:sz w:val="20"/>
+        </w:rPr>
+        <w:t>Aucune appréciation sur une personne. On décrit une organisation, pas des caractères.</w:t>
+      </w:r>
+    </w:p>
+    <w:p>
+      <w:pPr>
+        <w:spacing w:before="0" w:after="100"/>
+      </w:pPr>
+      <w:r>
+        <w:rPr>
+          <w:b/>
+          <w:i w:val="0"/>
+          <w:sz w:val="21"/>
+        </w:rPr>
+        <w:t>La règle pratique : ce qui identifie quelqu’un va au registre des signalements, à accès restreint. Ce qui décrit une organisation va au document unique, qui est consultable.</w:t>
+      </w:r>
+    </w:p>
+    <w:p>
+      <w:pPr>
+        <w:spacing w:before="280" w:after="80"/>
+      </w:pPr>
+      <w:r>
+        <w:rPr>
+          <w:b/>
+          <w:i w:val="0"/>
+          <w:color w:val="1F3B57"/>
+          <w:sz w:val="25"/>
+        </w:rPr>
+        <w:t>6. Quand le mettre à jour</w:t>
+      </w:r>
+    </w:p>
+    <w:p>
+      <w:pPr>
+        <w:spacing w:before="0" w:after="100"/>
+      </w:pPr>
+      <w:r>
+        <w:rPr>
+          <w:b w:val="0"/>
+          <w:i w:val="0"/>
+          <w:sz w:val="21"/>
+        </w:rPr>
+        <w:t>L’article R.4121-2 fixe trois déclencheurs : au moins chaque année dans les entreprises d’au moins onze salariés ; lors de toute décision d’aménagement important modifiant les conditions de santé, de sécurité ou les conditions de travail ; et lorsqu’une information supplémentaire intéressant l’évaluation d’un risque dans une unité de travail est portée à la connaissance de l’employeur.</w:t>
+      </w:r>
+    </w:p>
+    <w:p>
+      <w:pPr>
+        <w:spacing w:before="0" w:after="100"/>
+      </w:pPr>
+      <w:r>
+        <w:rPr>
+          <w:b/>
+          <w:i w:val="0"/>
+          <w:sz w:val="21"/>
+        </w:rPr>
+        <w:t>Le troisième cas est celui qu’on oublie, et c’est le plus dangereux : un signalement EST une information supplémentaire. Un signalement reçu et un document unique inchangé, c’est l’aveu écrit qu’on savait et qu’on n’a rien tiré de ce qu’on savait.</w:t>
+      </w:r>
+    </w:p>
+    <w:p>
+      <w:pPr>
+        <w:spacing w:before="0" w:after="100"/>
+      </w:pPr>
+      <w:r>
+        <w:rPr>
+          <w:b w:val="0"/>
+          <w:i w:val="0"/>
+          <w:sz w:val="21"/>
+        </w:rPr>
+        <w:t>Sont également des informations supplémentaires : un arrêt de travail long dans une même équipe, une alerte du médecin du travail, un droit d’alerte d’un élu, une inaptitude, une démission motivée par écrit, un compte rendu d’enquête. Chacune se date et se trace.</w:t>
+      </w:r>
+    </w:p>
+    <w:p>
+      <w:pPr>
+        <w:spacing w:before="0" w:after="100"/>
+      </w:pPr>
+      <w:r>
+        <w:rPr>
+          <w:b w:val="0"/>
+          <w:i/>
+          <w:color w:val="555555"/>
+          <w:sz w:val="19"/>
+        </w:rPr>
+        <w:t>À vérifier à la date de remise : les modalités de dépôt dématérialisé du document unique sur un portail numérique, dont le calendrier d’entrée en vigueur a été échelonné selon l’effectif.</w:t>
+      </w:r>
+    </w:p>
+    <w:p>
+      <w:pPr>
+        <w:spacing w:before="240" w:after="80"/>
+      </w:pPr>
+      <w:r>
+        <w:rPr>
+          <w:b/>
+          <w:i w:val="0"/>
+          <w:color w:val="1F3B57"/>
+          <w:sz w:val="25"/>
+        </w:rPr>
+        <w:t>Ce que l’action produit — les pièces à conserver</w:t>
+      </w:r>
+    </w:p>
+    <w:p>
+      <w:pPr>
+        <w:pStyle w:val="ListBullet"/>
+        <w:spacing w:after="40"/>
+      </w:pPr>
+      <w:r>
+        <w:rPr>
+          <w:sz w:val="20"/>
+        </w:rPr>
+        <w:t>Document unique daté, volet risques psychosociaux, avec la ligne « harcèlement » remplie pour chaque unité de travail concernée</w:t>
+      </w:r>
+    </w:p>
+    <w:p>
+      <w:pPr>
+        <w:pStyle w:val="ListBullet"/>
+        <w:spacing w:after="40"/>
+      </w:pPr>
+      <w:r>
+        <w:rPr>
+          <w:sz w:val="20"/>
+        </w:rPr>
+        <w:t>Programme annuel de prévention (au moins 50 salariés) ou liste d’actions intégrée (moins de 50 salariés)</w:t>
+      </w:r>
+    </w:p>
+    <w:p>
+      <w:pPr>
+        <w:pStyle w:val="ListBullet"/>
+        <w:spacing w:after="40"/>
+      </w:pPr>
+      <w:r>
+        <w:rPr>
+          <w:sz w:val="20"/>
+        </w:rPr>
+        <w:t>Procès-verbal de consultation du comité sur le document unique et sur le programme</w:t>
+      </w:r>
+    </w:p>
+    <w:p>
+      <w:pPr>
+        <w:pStyle w:val="ListBullet"/>
+        <w:spacing w:after="40"/>
+      </w:pPr>
+      <w:r>
+        <w:rPr>
+          <w:sz w:val="20"/>
+        </w:rPr>
+        <w:t>Historique des versions conservé — l’obligation de conservation est de quarante ans</w:t>
+      </w:r>
+    </w:p>
+    <w:p>
+      <w:pPr>
+        <w:pStyle w:val="ListBullet"/>
+        <w:spacing w:after="40"/>
+      </w:pPr>
+      <w:r>
+        <w:rPr>
+          <w:sz w:val="20"/>
+        </w:rPr>
+        <w:t>Preuve de mise à disposition : note de diffusion, avis d’accès, registre de consultation</w:t>
+      </w:r>
+    </w:p>
+    <w:p>
+      <w:pPr>
+        <w:pStyle w:val="ListBullet"/>
+        <w:spacing w:after="40"/>
+      </w:pPr>
+      <w:r>
+        <w:rPr>
+          <w:sz w:val="20"/>
+        </w:rPr>
+        <w:t>Pour chaque mise à jour, la pièce qui l’a déclenchée : signalement, alerte du médecin du travail, décision de réorganisation</w:t>
       </w:r>
     </w:p>
     <w:p>

</xml_diff>

<commit_message>
Les douze actions au meme niveau : code exige / n'exige pas, exemple rempli, erreurs qui annulent
</commit_message>
<xml_diff>
--- a/exemples/PROGRAMMES_PREVENTION_HARCELEMENT.docx
+++ b/exemples/PROGRAMMES_PREVENTION_HARCELEMENT.docx
@@ -2900,6 +2900,116 @@
           <w:color w:val="1F3B57"/>
           <w:sz w:val="25"/>
         </w:rPr>
+        <w:t>Les erreurs qui annulent l’action</w:t>
+      </w:r>
+    </w:p>
+    <w:p>
+      <w:pPr>
+        <w:pStyle w:val="ListBullet"/>
+        <w:spacing w:after="40"/>
+      </w:pPr>
+      <w:r>
+        <w:rPr>
+          <w:sz w:val="20"/>
+        </w:rPr>
+        <w:t>Une seule ligne « risques psychosociaux » pour toute l’entreprise, sans découpage par unité de travail.</w:t>
+      </w:r>
+    </w:p>
+    <w:p>
+      <w:pPr>
+        <w:pStyle w:val="ListBullet"/>
+        <w:spacing w:after="40"/>
+      </w:pPr>
+      <w:r>
+        <w:rPr>
+          <w:sz w:val="20"/>
+        </w:rPr>
+        <w:t>Une cotation renseignée, aucune mesure décidée : le document établit alors que vous saviez.</w:t>
+      </w:r>
+    </w:p>
+    <w:p>
+      <w:pPr>
+        <w:pStyle w:val="ListBullet"/>
+        <w:spacing w:after="40"/>
+      </w:pPr>
+      <w:r>
+        <w:rPr>
+          <w:sz w:val="20"/>
+        </w:rPr>
+        <w:t>Une mesure décidée sans responsable nommé ni date : personne ne l’exécute et personne ne répond.</w:t>
+      </w:r>
+    </w:p>
+    <w:p>
+      <w:pPr>
+        <w:pStyle w:val="ListBullet"/>
+        <w:spacing w:after="40"/>
+      </w:pPr>
+      <w:r>
+        <w:rPr>
+          <w:sz w:val="20"/>
+        </w:rPr>
+        <w:t>Un document unique acheté sur étagère, dont la ligne harcèlement est identique à celle de toutes les entreprises du même code NAF.</w:t>
+      </w:r>
+    </w:p>
+    <w:p>
+      <w:pPr>
+        <w:pStyle w:val="ListBullet"/>
+        <w:spacing w:after="40"/>
+      </w:pPr>
+      <w:r>
+        <w:rPr>
+          <w:sz w:val="20"/>
+        </w:rPr>
+        <w:t>Un signalement reçu et un document unique inchangé — c’est l’aveu écrit qu’on savait et qu’on n’en a rien tiré.</w:t>
+      </w:r>
+    </w:p>
+    <w:p>
+      <w:pPr>
+        <w:pStyle w:val="ListBullet"/>
+        <w:spacing w:after="40"/>
+      </w:pPr>
+      <w:r>
+        <w:rPr>
+          <w:sz w:val="20"/>
+        </w:rPr>
+        <w:t>Des noms de salariés dans le document unique, qui est consultable par tous.</w:t>
+      </w:r>
+    </w:p>
+    <w:p>
+      <w:pPr>
+        <w:pStyle w:val="ListBullet"/>
+        <w:spacing w:after="40"/>
+      </w:pPr>
+      <w:r>
+        <w:rPr>
+          <w:sz w:val="20"/>
+        </w:rPr>
+        <w:t>Aucune consultation du comité, ou une consultation non tracée.</w:t>
+      </w:r>
+    </w:p>
+    <w:p>
+      <w:pPr>
+        <w:pStyle w:val="ListBullet"/>
+        <w:spacing w:after="40"/>
+      </w:pPr>
+      <w:r>
+        <w:rPr>
+          <w:sz w:val="20"/>
+        </w:rPr>
+        <w:t>À partir de cinquante salariés, un programme annuel sans indicateur de résultat ni coût estimé : l’article L.4121-3-1 les exige tous les deux.</w:t>
+      </w:r>
+    </w:p>
+    <w:p>
+      <w:pPr>
+        <w:spacing w:before="240" w:after="80"/>
+      </w:pPr>
+      <w:r>
+        <w:rPr>
+          <w:b/>
+          <w:i w:val="0"/>
+          <w:color w:val="1F3B57"/>
+          <w:sz w:val="25"/>
+        </w:rPr>
         <w:t>Ce que l’action produit — les pièces à conserver</w:t>
       </w:r>
     </w:p>
@@ -4290,6 +4400,104 @@
           <w:color w:val="1F3B57"/>
           <w:sz w:val="25"/>
         </w:rPr>
+        <w:t>Les erreurs qui annulent l’action</w:t>
+      </w:r>
+    </w:p>
+    <w:p>
+      <w:pPr>
+        <w:pStyle w:val="ListBullet"/>
+        <w:spacing w:after="40"/>
+      </w:pPr>
+      <w:r>
+        <w:rPr>
+          <w:sz w:val="20"/>
+        </w:rPr>
+        <w:t>Une échelle des sanctions incomplète : la sanction que vous voudrez prononcer n’y figurera pas, et elle sera inopposable.</w:t>
+      </w:r>
+    </w:p>
+    <w:p>
+      <w:pPr>
+        <w:pStyle w:val="ListBullet"/>
+        <w:spacing w:after="40"/>
+      </w:pPr>
+      <w:r>
+        <w:rPr>
+          <w:sz w:val="20"/>
+        </w:rPr>
+        <w:t>Un règlement modifié et appliqué immédiatement, sans attendre le délai d’un mois suivant les formalités de dépôt et de publicité.</w:t>
+      </w:r>
+    </w:p>
+    <w:p>
+      <w:pPr>
+        <w:pStyle w:val="ListBullet"/>
+        <w:spacing w:after="40"/>
+      </w:pPr>
+      <w:r>
+        <w:rPr>
+          <w:sz w:val="20"/>
+        </w:rPr>
+        <w:t>Un dépôt au greffe fait, mais aucun récépissé conservé.</w:t>
+      </w:r>
+    </w:p>
+    <w:p>
+      <w:pPr>
+        <w:pStyle w:val="ListBullet"/>
+        <w:spacing w:after="40"/>
+      </w:pPr>
+      <w:r>
+        <w:rPr>
+          <w:sz w:val="20"/>
+        </w:rPr>
+        <w:t>Le comité consulté après coup, ou consulté sur un texte différent de celui déposé.</w:t>
+      </w:r>
+    </w:p>
+    <w:p>
+      <w:pPr>
+        <w:pStyle w:val="ListBullet"/>
+        <w:spacing w:after="40"/>
+      </w:pPr>
+      <w:r>
+        <w:rPr>
+          <w:sz w:val="20"/>
+        </w:rPr>
+        <w:t>Un règlement à jour au siège, jamais transmis aux établissements distincts.</w:t>
+      </w:r>
+    </w:p>
+    <w:p>
+      <w:pPr>
+        <w:pStyle w:val="ListBullet"/>
+        <w:spacing w:after="40"/>
+      </w:pPr>
+      <w:r>
+        <w:rPr>
+          <w:sz w:val="20"/>
+        </w:rPr>
+        <w:t>Des notes de service qui ajoutent des obligations disciplinaires sans être soumises à la même procédure — elles sont pourtant des adjonctions au règlement intérieur.</w:t>
+      </w:r>
+    </w:p>
+    <w:p>
+      <w:pPr>
+        <w:pStyle w:val="ListBullet"/>
+        <w:spacing w:after="40"/>
+      </w:pPr>
+      <w:r>
+        <w:rPr>
+          <w:sz w:val="20"/>
+        </w:rPr>
+        <w:t>Un règlement qui reprend les définitions du harcèlement dans une version antérieure à celle du code en vigueur.</w:t>
+      </w:r>
+    </w:p>
+    <w:p>
+      <w:pPr>
+        <w:spacing w:before="240" w:after="80"/>
+      </w:pPr>
+      <w:r>
+        <w:rPr>
+          <w:b/>
+          <w:i w:val="0"/>
+          <w:color w:val="1F3B57"/>
+          <w:sz w:val="25"/>
+        </w:rPr>
         <w:t>Ce que l’action produit — les pièces à conserver</w:t>
       </w:r>
     </w:p>
@@ -6189,6 +6397,116 @@
           <w:color w:val="1F3B57"/>
           <w:sz w:val="25"/>
         </w:rPr>
+        <w:t>Les erreurs qui annulent l’action</w:t>
+      </w:r>
+    </w:p>
+    <w:p>
+      <w:pPr>
+        <w:pStyle w:val="ListBullet"/>
+        <w:spacing w:after="40"/>
+      </w:pPr>
+      <w:r>
+        <w:rPr>
+          <w:sz w:val="20"/>
+        </w:rPr>
+        <w:t>Une procédure écrite, jamais diffusée : elle prouve seulement que vous saviez quoi faire et ne l’avez pas dit.</w:t>
+      </w:r>
+    </w:p>
+    <w:p>
+      <w:pPr>
+        <w:pStyle w:val="ListBullet"/>
+        <w:spacing w:after="40"/>
+      </w:pPr>
+      <w:r>
+        <w:rPr>
+          <w:sz w:val="20"/>
+        </w:rPr>
+        <w:t>Une seule porte d’entrée, le supérieur hiérarchique — c’est souvent la personne mise en cause.</w:t>
+      </w:r>
+    </w:p>
+    <w:p>
+      <w:pPr>
+        <w:pStyle w:val="ListBullet"/>
+        <w:spacing w:after="40"/>
+      </w:pPr>
+      <w:r>
+        <w:rPr>
+          <w:sz w:val="20"/>
+        </w:rPr>
+        <w:t>Des délais annoncés et jamais tenus : ils mesurent votre retard au lieu de prouver votre réactivité.</w:t>
+      </w:r>
+    </w:p>
+    <w:p>
+      <w:pPr>
+        <w:pStyle w:val="ListBullet"/>
+        <w:spacing w:after="40"/>
+      </w:pPr>
+      <w:r>
+        <w:rPr>
+          <w:sz w:val="20"/>
+        </w:rPr>
+        <w:t>La promesse de l’anonymat, qu’il faudra rompre dès la première audition.</w:t>
+      </w:r>
+    </w:p>
+    <w:p>
+      <w:pPr>
+        <w:pStyle w:val="ListBullet"/>
+        <w:spacing w:after="40"/>
+      </w:pPr>
+      <w:r>
+        <w:rPr>
+          <w:sz w:val="20"/>
+        </w:rPr>
+        <w:t>Une procédure qui exige un signalement écrit, motivé et documenté : elle inverse la charge de la preuve que l’article L.1154-1 aménage en sens contraire.</w:t>
+      </w:r>
+    </w:p>
+    <w:p>
+      <w:pPr>
+        <w:pStyle w:val="ListBullet"/>
+        <w:spacing w:after="40"/>
+      </w:pPr>
+      <w:r>
+        <w:rPr>
+          <w:sz w:val="20"/>
+        </w:rPr>
+        <w:t>Une procédure qui ne dit rien de la protection du salarié qui signale : c’est la clause qu’ils lisent, et son absence suffit à figer les langues.</w:t>
+      </w:r>
+    </w:p>
+    <w:p>
+      <w:pPr>
+        <w:pStyle w:val="ListBullet"/>
+        <w:spacing w:after="40"/>
+      </w:pPr>
+      <w:r>
+        <w:rPr>
+          <w:sz w:val="20"/>
+        </w:rPr>
+        <w:t>Un dispositif « lanceurs d’alerte » et un dispositif « harcèlement » qui coexistent sans se renvoyer l’un à l’autre : les signalements se perdent entre les deux.</w:t>
+      </w:r>
+    </w:p>
+    <w:p>
+      <w:pPr>
+        <w:pStyle w:val="ListBullet"/>
+        <w:spacing w:after="40"/>
+      </w:pPr>
+      <w:r>
+        <w:rPr>
+          <w:sz w:val="20"/>
+        </w:rPr>
+        <w:t>Aucune version pour les intérimaires et les prestataires présents sur site.</w:t>
+      </w:r>
+    </w:p>
+    <w:p>
+      <w:pPr>
+        <w:spacing w:before="240" w:after="80"/>
+      </w:pPr>
+      <w:r>
+        <w:rPr>
+          <w:b/>
+          <w:i w:val="0"/>
+          <w:color w:val="1F3B57"/>
+          <w:sz w:val="25"/>
+        </w:rPr>
         <w:t>Ce que l’action produit — les pièces à conserver</w:t>
       </w:r>
     </w:p>
@@ -6357,6 +6675,59 @@
           <w:sz w:val="21"/>
         </w:rPr>
         <w:t>Objectif. C’est la formation qui exonère. La Cour de cassation invite les juges à rechercher si l’employeur avait mis en œuvre des actions d’information et de formation propres à prévenir la survenance de faits de harcèlement moral. Sans elle, tout le reste tombe.</w:t>
+      </w:r>
+    </w:p>
+    <w:p>
+      <w:pPr>
+        <w:spacing w:before="240" w:after="80"/>
+      </w:pPr>
+      <w:r>
+        <w:rPr>
+          <w:b/>
+          <w:i w:val="0"/>
+          <w:color w:val="1F3B57"/>
+          <w:sz w:val="25"/>
+        </w:rPr>
+        <w:t>Ce que le code exige — et ce qu’il n’exige pas</w:t>
+      </w:r>
+    </w:p>
+    <w:p>
+      <w:pPr>
+        <w:spacing w:before="0" w:after="100"/>
+      </w:pPr>
+      <w:r>
+        <w:rPr>
+          <w:b w:val="0"/>
+          <w:i w:val="0"/>
+          <w:sz w:val="21"/>
+        </w:rPr>
+        <w:t>Il faut le dire d’emblée : aucun texte n’impose une formation au harcèlement moral pour l’encadrement. Ni durée, ni programme, ni organisme, ni périodicité. L’article L.4121-1 (2°) se borne à ranger « des actions d’information et de formation » parmi les mesures nécessaires, et l’article L.4121-2 (9°) impose de donner les instructions appropriées aux travailleurs.</w:t>
+      </w:r>
+    </w:p>
+    <w:p>
+      <w:pPr>
+        <w:spacing w:before="0" w:after="100"/>
+      </w:pPr>
+      <w:r>
+        <w:rPr>
+          <w:b/>
+          <w:i w:val="0"/>
+          <w:sz w:val="21"/>
+        </w:rPr>
+        <w:t>Ce qui rend cette formation obligatoire en fait, c’est la jurisprudence. L’employeur ne s’exonère que s’il justifie d’actions d’information et de formation menées en amont. Une entreprise sans formation de l’encadrement perd cette branche de l’exonération, quel que soit le reste de son dispositif. C’est donc la seule action des douze qui n’est obligatoire nulle part et indispensable partout.</w:t>
+      </w:r>
+    </w:p>
+    <w:p>
+      <w:pPr>
+        <w:spacing w:before="0" w:after="100"/>
+      </w:pPr>
+      <w:r>
+        <w:rPr>
+          <w:b w:val="0"/>
+          <w:i w:val="0"/>
+          <w:sz w:val="21"/>
+        </w:rPr>
+        <w:t>Conséquences pratiques. La formation peut être interne : rien n’impose un organisme extérieur ni une certification, sauf si vous mobilisez un financement qui l’exige. La durée de sept heures et la périodicité de deux ans sont nos recommandations, pas des règles. Ce qui est apprécié, c’est le contenu et l’effectivité — d’où le questionnaire corrigé, qui établit que la formation a été suivie et pas seulement dispensée.</w:t>
       </w:r>
     </w:p>
     <w:p>
@@ -7529,7 +7900,7 @@
           <w:color w:val="1F3B57"/>
           <w:sz w:val="25"/>
         </w:rPr>
-        <w:t>Ce que l’action produit — les pièces à conserver</w:t>
+        <w:t>Les erreurs qui annulent l’action</w:t>
       </w:r>
     </w:p>
     <w:p>
@@ -7541,7 +7912,7 @@
         <w:rPr>
           <w:sz w:val="20"/>
         </w:rPr>
-        <w:t>Programme daté et signé par l’intervenant</w:t>
+        <w:t>Une « sensibilisation » de quarante-cinq minutes en visioconférence, sans émargement et sans support conservé. Elle ne prouve rien.</w:t>
       </w:r>
     </w:p>
     <w:p>
@@ -7553,7 +7924,7 @@
         <w:rPr>
           <w:sz w:val="20"/>
         </w:rPr>
-        <w:t>Feuille d’émargement par demi-journée</w:t>
+        <w:t>Former la direction des ressources humaines et les directeurs, mais pas les chefs d’équipe, les tuteurs et les responsables de projet — ce sont eux qui exercent l’autorité au quotidien, et eux qui sont mis en cause.</w:t>
       </w:r>
     </w:p>
     <w:p>
@@ -7565,7 +7936,7 @@
         <w:rPr>
           <w:sz w:val="20"/>
         </w:rPr>
-        <w:t>Support remis à chaque participant, daté</w:t>
+        <w:t>Aucun rattrapage organisé pour les absents : la liste des convoqués sans la liste des présents se retourne contre l’employeur.</w:t>
       </w:r>
     </w:p>
     <w:p>
@@ -7577,7 +7948,7 @@
         <w:rPr>
           <w:sz w:val="20"/>
         </w:rPr>
-        <w:t>Questionnaire d’évaluation corrigé, nominatif</w:t>
+        <w:t>Une facture d’organisme portant « formation harcèlement » comme seule trace, sans programme ni contenu.</w:t>
       </w:r>
     </w:p>
     <w:p>
@@ -7589,7 +7960,7 @@
         <w:rPr>
           <w:sz w:val="20"/>
         </w:rPr>
-        <w:t>Attestation individuelle de formation</w:t>
+        <w:t>Une formation faite une fois, il y a six ans, jamais renouvelée, alors que la moitié de l’encadrement a changé.</w:t>
       </w:r>
     </w:p>
     <w:p>
@@ -7601,7 +7972,117 @@
         <w:rPr>
           <w:sz w:val="20"/>
         </w:rPr>
+        <w:t>Un module en ligne sans preuve d’achèvement individuelle et sans date.</w:t>
+      </w:r>
+    </w:p>
+    <w:p>
+      <w:pPr>
+        <w:pStyle w:val="ListBullet"/>
+        <w:spacing w:after="40"/>
+      </w:pPr>
+      <w:r>
+        <w:rPr>
+          <w:sz w:val="20"/>
+        </w:rPr>
+        <w:t>Des sessions à quarante participants : plus aucune mise en situation, et le module 6 — objectiver ses décisions — devient un exposé.</w:t>
+      </w:r>
+    </w:p>
+    <w:p>
+      <w:pPr>
+        <w:spacing w:before="240" w:after="80"/>
+      </w:pPr>
+      <w:r>
+        <w:rPr>
+          <w:b/>
+          <w:i w:val="0"/>
+          <w:color w:val="1F3B57"/>
+          <w:sz w:val="25"/>
+        </w:rPr>
+        <w:t>Ce que l’action produit — les pièces à conserver</w:t>
+      </w:r>
+    </w:p>
+    <w:p>
+      <w:pPr>
+        <w:pStyle w:val="ListBullet"/>
+        <w:spacing w:after="40"/>
+      </w:pPr>
+      <w:r>
+        <w:rPr>
+          <w:sz w:val="20"/>
+        </w:rPr>
+        <w:t>Programme daté et signé par l’intervenant</w:t>
+      </w:r>
+    </w:p>
+    <w:p>
+      <w:pPr>
+        <w:pStyle w:val="ListBullet"/>
+        <w:spacing w:after="40"/>
+      </w:pPr>
+      <w:r>
+        <w:rPr>
+          <w:sz w:val="20"/>
+        </w:rPr>
+        <w:t>Feuille d’émargement par demi-journée</w:t>
+      </w:r>
+    </w:p>
+    <w:p>
+      <w:pPr>
+        <w:pStyle w:val="ListBullet"/>
+        <w:spacing w:after="40"/>
+      </w:pPr>
+      <w:r>
+        <w:rPr>
+          <w:sz w:val="20"/>
+        </w:rPr>
+        <w:t>Support remis à chaque participant, daté</w:t>
+      </w:r>
+    </w:p>
+    <w:p>
+      <w:pPr>
+        <w:pStyle w:val="ListBullet"/>
+        <w:spacing w:after="40"/>
+      </w:pPr>
+      <w:r>
+        <w:rPr>
+          <w:sz w:val="20"/>
+        </w:rPr>
+        <w:t>Questionnaire d’évaluation corrigé, nominatif</w:t>
+      </w:r>
+    </w:p>
+    <w:p>
+      <w:pPr>
+        <w:pStyle w:val="ListBullet"/>
+        <w:spacing w:after="40"/>
+      </w:pPr>
+      <w:r>
+        <w:rPr>
+          <w:sz w:val="20"/>
+        </w:rPr>
+        <w:t>Attestation individuelle de formation</w:t>
+      </w:r>
+    </w:p>
+    <w:p>
+      <w:pPr>
+        <w:pStyle w:val="ListBullet"/>
+        <w:spacing w:after="40"/>
+      </w:pPr>
+      <w:r>
+        <w:rPr>
+          <w:sz w:val="20"/>
+        </w:rPr>
         <w:t>Liste des encadrants convoqués et des absents, avec la date de leur rattrapage</w:t>
+      </w:r>
+    </w:p>
+    <w:p>
+      <w:pPr>
+        <w:pStyle w:val="ListBullet"/>
+        <w:spacing w:after="40"/>
+      </w:pPr>
+      <w:r>
+        <w:rPr>
+          <w:sz w:val="20"/>
+        </w:rPr>
+        <w:t>Tableau de suivi : encadrants en poste / formés / date / échéance de rappel</w:t>
       </w:r>
     </w:p>
     <w:p>
@@ -8652,6 +9133,86 @@
     </w:p>
     <w:p>
       <w:pPr>
+        <w:spacing w:before="240" w:after="80"/>
+      </w:pPr>
+      <w:r>
+        <w:rPr>
+          <w:b/>
+          <w:i w:val="0"/>
+          <w:color w:val="1F3B57"/>
+          <w:sz w:val="25"/>
+        </w:rPr>
+        <w:t>Ce que le code exige — et ce qu’il n’exige pas</w:t>
+      </w:r>
+    </w:p>
+    <w:p>
+      <w:pPr>
+        <w:spacing w:before="0" w:after="100"/>
+      </w:pPr>
+      <w:r>
+        <w:rPr>
+          <w:b/>
+          <w:i w:val="0"/>
+          <w:sz w:val="21"/>
+        </w:rPr>
+        <w:t>Il faut distinguer les deux référents, parce que leur régime n’est pas le même.</w:t>
+      </w:r>
+    </w:p>
+    <w:p>
+      <w:pPr>
+        <w:spacing w:before="0" w:after="100"/>
+      </w:pPr>
+      <w:r>
+        <w:rPr>
+          <w:b w:val="0"/>
+          <w:i w:val="0"/>
+          <w:sz w:val="21"/>
+        </w:rPr>
+        <w:t>Le référent du comité est un élu. À ce titre, il bénéficie de la formation en santé, sécurité et conditions de travail de l’article L.2315-18, dont le financement est à la charge de l’employeur. Cette formation est obligatoire — mais elle est générale : rien n’impose qu’elle comporte un module sur le harcèlement, et beaucoup de programmes du marché n’en comportent pas. Vérifiez le programme avant d’inscrire, pas après.</w:t>
+      </w:r>
+    </w:p>
+    <w:p>
+      <w:pPr>
+        <w:spacing w:before="0" w:after="100"/>
+      </w:pPr>
+      <w:r>
+        <w:rPr>
+          <w:b/>
+          <w:i w:val="0"/>
+          <w:sz w:val="21"/>
+        </w:rPr>
+        <w:t>Le référent de l’employeur, lui, n’a aucune formation obligatoire prévue par le code. L’article L.1153-5-1 le charge d’orienter, d’informer et d’accompagner, sans rien dire de sa qualification. C’est un angle mort complet : la personne désignée pour recevoir les signalements peut légalement n’avoir jamais été formée. Le former relève donc de la seule obligation générale de sécurité — et de l’intérêt bien compris de l’employeur, puisque c’est lui qui répond des erreurs de son référent.</w:t>
+      </w:r>
+    </w:p>
+    <w:p>
+      <w:pPr>
+        <w:spacing w:before="0" w:after="100"/>
+      </w:pPr>
+      <w:r>
+        <w:rPr>
+          <w:b w:val="0"/>
+          <w:i/>
+          <w:color w:val="555555"/>
+          <w:sz w:val="19"/>
+        </w:rPr>
+        <w:t>À vérifier à la date de la commande : les durées minimales de la formation santé-sécurité des élus, qui distinguent le premier mandat du renouvellement et la taille de l’entreprise. Nous ne les reproduisons pas ici de mémoire.</w:t>
+      </w:r>
+    </w:p>
+    <w:p>
+      <w:pPr>
+        <w:spacing w:before="0" w:after="100"/>
+      </w:pPr>
+      <w:r>
+        <w:rPr>
+          <w:b w:val="0"/>
+          <w:i w:val="0"/>
+          <w:sz w:val="21"/>
+        </w:rPr>
+        <w:t>Nos deux jours ne sont donc pas une durée légale : c’est le temps nécessaire pour tenir les six modules ci-dessous, dont quatre heures de cas pratique.</w:t>
+      </w:r>
+    </w:p>
+    <w:p>
+      <w:pPr>
         <w:spacing w:before="200" w:after="40"/>
       </w:pPr>
       <w:r>
@@ -9575,7 +10136,7 @@
           <w:color w:val="1F3B57"/>
           <w:sz w:val="25"/>
         </w:rPr>
-        <w:t>Ce que l’action produit — les pièces à conserver</w:t>
+        <w:t>Les erreurs qui annulent l’action</w:t>
       </w:r>
     </w:p>
     <w:p>
@@ -9587,7 +10148,7 @@
         <w:rPr>
           <w:sz w:val="20"/>
         </w:rPr>
-        <w:t>Programme daté</w:t>
+        <w:t>Un référent désigné et jamais formé — c’est le cas le plus fréquent, et le premier vice que révèle le contentieux.</w:t>
       </w:r>
     </w:p>
     <w:p>
@@ -9599,7 +10160,7 @@
         <w:rPr>
           <w:sz w:val="20"/>
         </w:rPr>
-        <w:t>Feuille d’émargement</w:t>
+        <w:t>Une formation générale d’élu, sans aucun module harcèlement, présentée comme la formation du référent.</w:t>
       </w:r>
     </w:p>
     <w:p>
@@ -9611,7 +10172,7 @@
         <w:rPr>
           <w:sz w:val="20"/>
         </w:rPr>
-        <w:t>Trame d’entretien de recueil</w:t>
+        <w:t>Le référent de l’employeur laissé de côté parce que « le code ne l’impose pas ».</w:t>
       </w:r>
     </w:p>
     <w:p>
@@ -9623,7 +10184,7 @@
         <w:rPr>
           <w:sz w:val="20"/>
         </w:rPr>
-        <w:t>Modèle de lettre de mission de la commission d’enquête</w:t>
+        <w:t>Une formation organisée après le premier signalement : la date de l’attestation dit tout.</w:t>
       </w:r>
     </w:p>
     <w:p>
@@ -9635,7 +10196,7 @@
         <w:rPr>
           <w:sz w:val="20"/>
         </w:rPr>
-        <w:t>Modèle de compte rendu d’audition</w:t>
+        <w:t>Le référent formé, mais pas les membres de la commission santé, sécurité et conditions de travail qui siégeront avec lui à l’enquête.</w:t>
       </w:r>
     </w:p>
     <w:p>
@@ -9647,7 +10208,7 @@
         <w:rPr>
           <w:sz w:val="20"/>
         </w:rPr>
-        <w:t>Modèle de rapport d’enquête</w:t>
+        <w:t>Aucune actualisation : la jurisprudence sur la preuve et sur la nullité a bougé trois fois en deux ans.</w:t>
       </w:r>
     </w:p>
     <w:p>
@@ -9659,7 +10220,117 @@
         <w:rPr>
           <w:sz w:val="20"/>
         </w:rPr>
-        <w:t>Attestation individuelle de formation</w:t>
+        <w:t>Un référent formé qui repart avec les modèles mais sans les moyens de s’en servir — pas de local, pas d’heures, pas de ligne dédiée.</w:t>
+      </w:r>
+    </w:p>
+    <w:p>
+      <w:pPr>
+        <w:spacing w:before="240" w:after="80"/>
+      </w:pPr>
+      <w:r>
+        <w:rPr>
+          <w:b/>
+          <w:i w:val="0"/>
+          <w:color w:val="1F3B57"/>
+          <w:sz w:val="25"/>
+        </w:rPr>
+        <w:t>Ce que l’action produit — les pièces à conserver</w:t>
+      </w:r>
+    </w:p>
+    <w:p>
+      <w:pPr>
+        <w:pStyle w:val="ListBullet"/>
+        <w:spacing w:after="40"/>
+      </w:pPr>
+      <w:r>
+        <w:rPr>
+          <w:sz w:val="20"/>
+        </w:rPr>
+        <w:t>Programme daté</w:t>
+      </w:r>
+    </w:p>
+    <w:p>
+      <w:pPr>
+        <w:pStyle w:val="ListBullet"/>
+        <w:spacing w:after="40"/>
+      </w:pPr>
+      <w:r>
+        <w:rPr>
+          <w:sz w:val="20"/>
+        </w:rPr>
+        <w:t>Feuille d’émargement</w:t>
+      </w:r>
+    </w:p>
+    <w:p>
+      <w:pPr>
+        <w:pStyle w:val="ListBullet"/>
+        <w:spacing w:after="40"/>
+      </w:pPr>
+      <w:r>
+        <w:rPr>
+          <w:sz w:val="20"/>
+        </w:rPr>
+        <w:t>Trame d’entretien de recueil</w:t>
+      </w:r>
+    </w:p>
+    <w:p>
+      <w:pPr>
+        <w:pStyle w:val="ListBullet"/>
+        <w:spacing w:after="40"/>
+      </w:pPr>
+      <w:r>
+        <w:rPr>
+          <w:sz w:val="20"/>
+        </w:rPr>
+        <w:t>Modèle de lettre de mission de la commission d’enquête</w:t>
+      </w:r>
+    </w:p>
+    <w:p>
+      <w:pPr>
+        <w:pStyle w:val="ListBullet"/>
+        <w:spacing w:after="40"/>
+      </w:pPr>
+      <w:r>
+        <w:rPr>
+          <w:sz w:val="20"/>
+        </w:rPr>
+        <w:t>Modèle de compte rendu d’audition</w:t>
+      </w:r>
+    </w:p>
+    <w:p>
+      <w:pPr>
+        <w:pStyle w:val="ListBullet"/>
+        <w:spacing w:after="40"/>
+      </w:pPr>
+      <w:r>
+        <w:rPr>
+          <w:sz w:val="20"/>
+        </w:rPr>
+        <w:t>Modèle de rapport d’enquête</w:t>
+      </w:r>
+    </w:p>
+    <w:p>
+      <w:pPr>
+        <w:pStyle w:val="ListBullet"/>
+        <w:spacing w:after="40"/>
+      </w:pPr>
+      <w:r>
+        <w:rPr>
+          <w:sz w:val="20"/>
+        </w:rPr>
+        <w:t>Attestation individuelle de formation, pour le référent du comité comme pour celui de l’employeur</w:t>
+      </w:r>
+    </w:p>
+    <w:p>
+      <w:pPr>
+        <w:pStyle w:val="ListBullet"/>
+        <w:spacing w:after="40"/>
+      </w:pPr>
+      <w:r>
+        <w:rPr>
+          <w:sz w:val="20"/>
+        </w:rPr>
+        <w:t>Programme de la formation santé-sécurité suivie par les élus, montrant le module harcèlement</w:t>
       </w:r>
     </w:p>
     <w:p>
@@ -10398,6 +11069,59 @@
     </w:p>
     <w:p>
       <w:pPr>
+        <w:spacing w:before="240" w:after="80"/>
+      </w:pPr>
+      <w:r>
+        <w:rPr>
+          <w:b/>
+          <w:i w:val="0"/>
+          <w:color w:val="1F3B57"/>
+          <w:sz w:val="25"/>
+        </w:rPr>
+        <w:t>Ce que le code exige — et ce qu’il n’exige pas</w:t>
+      </w:r>
+    </w:p>
+    <w:p>
+      <w:pPr>
+        <w:spacing w:before="0" w:after="100"/>
+      </w:pPr>
+      <w:r>
+        <w:rPr>
+          <w:b w:val="0"/>
+          <w:i w:val="0"/>
+          <w:sz w:val="21"/>
+        </w:rPr>
+        <w:t>Le code impose de porter à la connaissance des salariés les textes et les voies de recours : c’est l’action 2, et elle se satisfait d’un affichage. Il n’impose aucune réunion, aucune session, aucune durée. Cette action 9 va donc au-delà de la lettre du code.</w:t>
+      </w:r>
+    </w:p>
+    <w:p>
+      <w:pPr>
+        <w:spacing w:before="0" w:after="100"/>
+      </w:pPr>
+      <w:r>
+        <w:rPr>
+          <w:b/>
+          <w:i w:val="0"/>
+          <w:sz w:val="21"/>
+        </w:rPr>
+        <w:t>Pourquoi la mener quand même : parce que l’exonération se joue sur des « actions d’information et de formation », au pluriel, et qu’un affichage n’est pas une action d’information au sens où les juges l’entendent. Parce que le principe 8° donne la priorité aux mesures collectives. Et parce qu’un dispositif que personne ne connaît ne produit aucun signalement — ce qui se lit ensuite, à tort, comme l’absence de problème.</w:t>
+      </w:r>
+    </w:p>
+    <w:p>
+      <w:pPr>
+        <w:spacing w:before="0" w:after="100"/>
+      </w:pPr>
+      <w:r>
+        <w:rPr>
+          <w:b w:val="0"/>
+          <w:i w:val="0"/>
+          <w:sz w:val="21"/>
+        </w:rPr>
+        <w:t>Ce qui n’est pas exigé : ni le présentiel, ni une durée, ni un intervenant extérieur. Un module écrit avec accusé de lecture est recevable. Ce qui compte est ailleurs : la preuve que chaque salarié a été atteint, et non que l’information a été rendue disponible.</w:t>
+      </w:r>
+    </w:p>
+    <w:p>
+      <w:pPr>
         <w:spacing w:before="200" w:after="40"/>
       </w:pPr>
       <w:r>
@@ -10970,6 +11694,104 @@
         </w:tc>
       </w:tr>
     </w:tbl>
+    <w:p>
+      <w:pPr>
+        <w:spacing w:before="240" w:after="80"/>
+      </w:pPr>
+      <w:r>
+        <w:rPr>
+          <w:b/>
+          <w:i w:val="0"/>
+          <w:color w:val="1F3B57"/>
+          <w:sz w:val="25"/>
+        </w:rPr>
+        <w:t>Les erreurs qui annulent l’action</w:t>
+      </w:r>
+    </w:p>
+    <w:p>
+      <w:pPr>
+        <w:pStyle w:val="ListBullet"/>
+        <w:spacing w:after="40"/>
+      </w:pPr>
+      <w:r>
+        <w:rPr>
+          <w:sz w:val="20"/>
+        </w:rPr>
+        <w:t>Une note de service envoyée par courriel, sans accusé de lecture : rien ne dit qu’elle a été ouverte.</w:t>
+      </w:r>
+    </w:p>
+    <w:p>
+      <w:pPr>
+        <w:pStyle w:val="ListBullet"/>
+        <w:spacing w:after="40"/>
+      </w:pPr>
+      <w:r>
+        <w:rPr>
+          <w:sz w:val="20"/>
+        </w:rPr>
+        <w:t>Les équipes de nuit, les temps partiels, les salariés en déplacement et les sites éloignés oubliés — ce sont statistiquement les plus exposés.</w:t>
+      </w:r>
+    </w:p>
+    <w:p>
+      <w:pPr>
+        <w:pStyle w:val="ListBullet"/>
+        <w:spacing w:after="40"/>
+      </w:pPr>
+      <w:r>
+        <w:rPr>
+          <w:sz w:val="20"/>
+        </w:rPr>
+        <w:t>Les intérimaires et les salariés de prestataires exclus, alors que l’entreprise utilisatrice répond de leur sécurité.</w:t>
+      </w:r>
+    </w:p>
+    <w:p>
+      <w:pPr>
+        <w:pStyle w:val="ListBullet"/>
+        <w:spacing w:after="40"/>
+      </w:pPr>
+      <w:r>
+        <w:rPr>
+          <w:sz w:val="20"/>
+        </w:rPr>
+        <w:t>Une information qui énonce l’interdit sans dire à qui parler : elle informe sans orienter, et ne produit aucun signalement.</w:t>
+      </w:r>
+    </w:p>
+    <w:p>
+      <w:pPr>
+        <w:pStyle w:val="ListBullet"/>
+        <w:spacing w:after="40"/>
+      </w:pPr>
+      <w:r>
+        <w:rPr>
+          <w:sz w:val="20"/>
+        </w:rPr>
+        <w:t>Une information qui ne dit pas la limite — sanction justifiée, réorganisation, exigence managériale : le dispositif perd sa crédibilité auprès de l’encadrement.</w:t>
+      </w:r>
+    </w:p>
+    <w:p>
+      <w:pPr>
+        <w:pStyle w:val="ListBullet"/>
+        <w:spacing w:after="40"/>
+      </w:pPr>
+      <w:r>
+        <w:rPr>
+          <w:sz w:val="20"/>
+        </w:rPr>
+        <w:t>Une session unique, jamais renouvelée, alors que le personnel a tourné de trente pour cent.</w:t>
+      </w:r>
+    </w:p>
+    <w:p>
+      <w:pPr>
+        <w:pStyle w:val="ListBullet"/>
+        <w:spacing w:after="40"/>
+      </w:pPr>
+      <w:r>
+        <w:rPr>
+          <w:sz w:val="20"/>
+        </w:rPr>
+        <w:t>Aucune liste des destinataires rapprochée de l’effectif : impossible de dire qui manque.</w:t>
+      </w:r>
+    </w:p>
     <w:p>
       <w:pPr>
         <w:spacing w:before="240" w:after="80"/>
@@ -12653,6 +13475,20 @@
     </w:p>
     <w:p>
       <w:pPr>
+        <w:spacing w:before="240" w:after="80"/>
+      </w:pPr>
+      <w:r>
+        <w:rPr>
+          <w:b/>
+          <w:i w:val="0"/>
+          <w:color w:val="1F3B57"/>
+          <w:sz w:val="25"/>
+        </w:rPr>
+        <w:t>Ce que le code exige — et ce qu’il n’exige pas</w:t>
+      </w:r>
+    </w:p>
+    <w:p>
+      <w:pPr>
         <w:spacing w:before="0" w:after="100"/>
       </w:pPr>
       <w:r>
@@ -13378,6 +14214,116 @@
           <w:color w:val="1F3B57"/>
           <w:sz w:val="25"/>
         </w:rPr>
+        <w:t>Les erreurs qui annulent l’action</w:t>
+      </w:r>
+    </w:p>
+    <w:p>
+      <w:pPr>
+        <w:pStyle w:val="ListBullet"/>
+        <w:spacing w:after="40"/>
+      </w:pPr>
+      <w:r>
+        <w:rPr>
+          <w:sz w:val="20"/>
+        </w:rPr>
+        <w:t>Un registre tenu dans un tableur partagé, accessible à toute la direction des ressources humaines : la confidentialité est perdue et la responsabilité engagée.</w:t>
+      </w:r>
+    </w:p>
+    <w:p>
+      <w:pPr>
+        <w:pStyle w:val="ListBullet"/>
+        <w:spacing w:after="40"/>
+      </w:pPr>
+      <w:r>
+        <w:rPr>
+          <w:sz w:val="20"/>
+        </w:rPr>
+        <w:t>Des noms en clair, des arrêts de travail, des appréciations sur les personnes.</w:t>
+      </w:r>
+    </w:p>
+    <w:p>
+      <w:pPr>
+        <w:pStyle w:val="ListBullet"/>
+        <w:spacing w:after="40"/>
+      </w:pPr>
+      <w:r>
+        <w:rPr>
+          <w:sz w:val="20"/>
+        </w:rPr>
+        <w:t>Une qualification juridique portée par celui qui saisit — « harcèlement avéré », « plainte infondée ».</w:t>
+      </w:r>
+    </w:p>
+    <w:p>
+      <w:pPr>
+        <w:pStyle w:val="ListBullet"/>
+        <w:spacing w:after="40"/>
+      </w:pPr>
+      <w:r>
+        <w:rPr>
+          <w:sz w:val="20"/>
+        </w:rPr>
+        <w:t>Les signalements oraux non inscrits parce qu’ils « n’étaient pas officiels ». C’est précisément ceux-là qui feront la date de connaissance des faits.</w:t>
+      </w:r>
+    </w:p>
+    <w:p>
+      <w:pPr>
+        <w:pStyle w:val="ListBullet"/>
+        <w:spacing w:after="40"/>
+      </w:pPr>
+      <w:r>
+        <w:rPr>
+          <w:sz w:val="20"/>
+        </w:rPr>
+        <w:t>Aucun calcul des délais : le seul chiffre que le juge regardera n’existe pas.</w:t>
+      </w:r>
+    </w:p>
+    <w:p>
+      <w:pPr>
+        <w:pStyle w:val="ListBullet"/>
+        <w:spacing w:after="40"/>
+      </w:pPr>
+      <w:r>
+        <w:rPr>
+          <w:sz w:val="20"/>
+        </w:rPr>
+        <w:t>Aucune remontée vers le document unique : l’article R.4121-2 est alors méconnu.</w:t>
+      </w:r>
+    </w:p>
+    <w:p>
+      <w:pPr>
+        <w:pStyle w:val="ListBullet"/>
+        <w:spacing w:after="40"/>
+      </w:pPr>
+      <w:r>
+        <w:rPr>
+          <w:sz w:val="20"/>
+        </w:rPr>
+        <w:t>Un bilan annuel jamais présenté au comité.</w:t>
+      </w:r>
+    </w:p>
+    <w:p>
+      <w:pPr>
+        <w:pStyle w:val="ListBullet"/>
+        <w:spacing w:after="40"/>
+      </w:pPr>
+      <w:r>
+        <w:rPr>
+          <w:sz w:val="20"/>
+        </w:rPr>
+        <w:t>Un registre à zéro signalement présenté comme un résultat, alors que c’est un symptôme.</w:t>
+      </w:r>
+    </w:p>
+    <w:p>
+      <w:pPr>
+        <w:spacing w:before="240" w:after="80"/>
+      </w:pPr>
+      <w:r>
+        <w:rPr>
+          <w:b/>
+          <w:i w:val="0"/>
+          <w:color w:val="1F3B57"/>
+          <w:sz w:val="25"/>
+        </w:rPr>
         <w:t>Ce que l’action produit — les pièces à conserver</w:t>
       </w:r>
     </w:p>
@@ -13520,6 +14466,59 @@
           <w:sz w:val="21"/>
         </w:rPr>
         <w:t>Le principe 6° donne la règle de conduite la plus utile du dossier : on remplace ce qui est dangereux par ce qui l’est moins. Séparer les personnes est moins dangereux que les laisser ensemble ; déplacer la victime est plus dangereux que de ne rien faire, parce que cela ajoute un fait au dossier de l’employeur.</w:t>
+      </w:r>
+    </w:p>
+    <w:p>
+      <w:pPr>
+        <w:spacing w:before="240" w:after="80"/>
+      </w:pPr>
+      <w:r>
+        <w:rPr>
+          <w:b/>
+          <w:i w:val="0"/>
+          <w:color w:val="1F3B57"/>
+          <w:sz w:val="25"/>
+        </w:rPr>
+        <w:t>Ce que le code exige — et ce qu’il n’exige pas</w:t>
+      </w:r>
+    </w:p>
+    <w:p>
+      <w:pPr>
+        <w:spacing w:before="0" w:after="100"/>
+      </w:pPr>
+      <w:r>
+        <w:rPr>
+          <w:b w:val="0"/>
+          <w:i w:val="0"/>
+          <w:sz w:val="21"/>
+        </w:rPr>
+        <w:t>Le code impose le résultat, pas la méthode. L’employeur prend toutes dispositions nécessaires en vue de prévenir les agissements de harcèlement (L.1152-4, L.1153-5), et aucun salarié ne peut être sanctionné pour avoir subi, refusé de subir, relaté ou témoigné de tels faits (L.1152-2, L.1153-2). Rien de plus.</w:t>
+      </w:r>
+    </w:p>
+    <w:p>
+      <w:pPr>
+        <w:spacing w:before="0" w:after="100"/>
+      </w:pPr>
+      <w:r>
+        <w:rPr>
+          <w:b/>
+          <w:i w:val="0"/>
+          <w:sz w:val="21"/>
+        </w:rPr>
+        <w:t>Ce que le code ne fixe pas : aucun délai, aucune obligation d’enquêter, aucune forme de décision, aucune obligation de suivi. L’enquête interne n’est pas obligatoire en soi (Cass. soc., 12 juin 2024, n° 23-13.975), et elle ne suffit pas davantage à exonérer.</w:t>
+      </w:r>
+    </w:p>
+    <w:p>
+      <w:pPr>
+        <w:spacing w:before="0" w:after="100"/>
+      </w:pPr>
+      <w:r>
+        <w:rPr>
+          <w:b w:val="0"/>
+          <w:i w:val="0"/>
+          <w:sz w:val="21"/>
+        </w:rPr>
+        <w:t>Ce sont donc la jurisprudence et vos propres engagements qui font la règle : la réaction doit être immédiate et adaptée dès que l’employeur est informé. Le protocole ci-dessous transforme « immédiate » en dates, et « adaptée » en pièces. Sans cela, ces deux mots ne se prouvent pas.</w:t>
       </w:r>
     </w:p>
     <w:p>
@@ -13902,7 +14901,7 @@
           <w:color w:val="1F3B57"/>
           <w:sz w:val="25"/>
         </w:rPr>
-        <w:t>Ce qui fait perdre, à ce stade</w:t>
+        <w:t>Les erreurs qui annulent l’action — et qui font perdre le procès</w:t>
       </w:r>
     </w:p>
     <w:p>

</xml_diff>

<commit_message>
DUERP des le 1er salarie, PAPRIPACT en document distinct, affichage D.4711-1
</commit_message>
<xml_diff>
--- a/exemples/PROGRAMMES_PREVENTION_HARCELEMENT.docx
+++ b/exemples/PROGRAMMES_PREVENTION_HARCELEMENT.docx
@@ -297,7 +297,7 @@
                 <w:b/>
                 <w:sz w:val="18"/>
               </w:rPr>
-              <w:t>Inscrire le risque au document unique</w:t>
+              <w:t>Inscrire le risque au document unique, et en tirer le programme annuel</w:t>
             </w:r>
           </w:p>
         </w:tc>
@@ -339,7 +339,7 @@
                 <w:color w:val="555555"/>
                 <w:sz w:val="17"/>
               </w:rPr>
-              <w:t>Document unique daté, volet risques psychosociaux</w:t>
+              <w:t>Document unique daté, volet RPS, et PAPRIPACT</w:t>
             </w:r>
           </w:p>
         </w:tc>
@@ -398,7 +398,7 @@
               <w:rPr>
                 <w:sz w:val="17"/>
               </w:rPr>
-              <w:t>L.1152-4, L.1153-5, D.1151-1</w:t>
+              <w:t>L.1152-4, L.1153-5, D.1151-1, D.4711-1</w:t>
             </w:r>
           </w:p>
         </w:tc>
@@ -1944,24 +1944,24 @@
       </w:pPr>
       <w:r>
         <w:rPr>
+          <w:b/>
+          <w:i w:val="0"/>
+          <w:sz w:val="21"/>
+        </w:rPr>
+        <w:t>Le document unique est obligatoire dans toute entreprise dès le premier salarié. Il n’y a pas de seuil : c’est le seuil de onze salariés qui commande la périodicité de la mise à jour, pas l’existence du document.</w:t>
+      </w:r>
+    </w:p>
+    <w:p>
+      <w:pPr>
+        <w:spacing w:before="0" w:after="100"/>
+      </w:pPr>
+      <w:r>
+        <w:rPr>
           <w:b w:val="0"/>
           <w:i w:val="0"/>
           <w:sz w:val="21"/>
         </w:rPr>
-        <w:t>L’article R.4121-1 impose de transcrire dans un document unique « les résultats de l’évaluation des risques pour la santé et la sécurité des travailleurs », évaluation qui comporte un inventaire des risques identifiés dans chaque unité de travail.</w:t>
-      </w:r>
-    </w:p>
-    <w:p>
-      <w:pPr>
-        <w:spacing w:before="0" w:after="100"/>
-      </w:pPr>
-      <w:r>
-        <w:rPr>
-          <w:b w:val="0"/>
-          <w:i w:val="0"/>
-          <w:sz w:val="21"/>
-        </w:rPr>
-        <w:t>L’article L.4121-3-1 ajoute ce que les résultats doivent produire : dans les entreprises d’au moins cinquante salariés, un programme annuel de prévention des risques professionnels et d’amélioration des conditions de travail, qui fixe la liste détaillée des mesures à prendre dans l’année, et pour chacune ses conditions d’exécution, un indicateur de résultat et une estimation de son coût. Dans les entreprises de moins de cinquante salariés, une liste d’actions, intégrée au document unique lui-même. Le document et ses mises à jour se conservent quarante ans.</w:t>
+        <w:t>L’article R.4121-1 impose de transcrire dans un document unique « les résultats de l’évaluation des risques pour la santé et la sécurité des travailleurs », évaluation qui comporte un inventaire des risques identifiés dans chaque unité de travail. Le document unique est mis à la disposition des travailleurs, du comité, du médecin du travail et de l’inspection du travail (R.4121-4). Il se conserve, avec ses versions successives, pendant quarante ans.</w:t>
       </w:r>
     </w:p>
     <w:p>
@@ -2736,7 +2736,7 @@
     </w:tbl>
     <w:p>
       <w:pPr>
-        <w:spacing w:before="280" w:after="80"/>
+        <w:spacing w:before="240" w:after="80"/>
       </w:pPr>
       <w:r>
         <w:rPr>
@@ -2833,7 +2833,73 @@
           <w:color w:val="1F3B57"/>
           <w:sz w:val="25"/>
         </w:rPr>
-        <w:t>6. Quand le mettre à jour</w:t>
+        <w:t>6. Le PAPRIPACT — un second document, pas une rubrique du premier</w:t>
+      </w:r>
+    </w:p>
+    <w:p>
+      <w:pPr>
+        <w:spacing w:before="0" w:after="100"/>
+      </w:pPr>
+      <w:r>
+        <w:rPr>
+          <w:b w:val="0"/>
+          <w:i w:val="0"/>
+          <w:sz w:val="21"/>
+        </w:rPr>
+        <w:t>Le document unique identifie et évalue. Il ne décide pas. Ce qui décide, c’est ce que l’article L.4121-3-1 fait découler de ses résultats — et c’est un document distinct.</w:t>
+      </w:r>
+    </w:p>
+    <w:p>
+      <w:pPr>
+        <w:spacing w:before="0" w:after="100"/>
+      </w:pPr>
+      <w:r>
+        <w:rPr>
+          <w:b w:val="0"/>
+          <w:i w:val="0"/>
+          <w:sz w:val="21"/>
+        </w:rPr>
+        <w:t>À partir de cinquante salariés : le programme annuel de prévention des risques professionnels et d’amélioration des conditions de travail, le PAPRIPACT. Il fixe la liste détaillée des mesures à prendre dans l’année à venir et, pour chaque mesure, ses conditions d’exécution, un indicateur de résultat et une estimation de son coût. C’est un document propre, daté, soumis au comité, distinct du document unique même s’il en découle entièrement.</w:t>
+      </w:r>
+    </w:p>
+    <w:p>
+      <w:pPr>
+        <w:spacing w:before="0" w:after="100"/>
+      </w:pPr>
+      <w:r>
+        <w:rPr>
+          <w:b w:val="0"/>
+          <w:i w:val="0"/>
+          <w:sz w:val="21"/>
+        </w:rPr>
+        <w:t>En dessous de cinquante salariés : pas de PAPRIPACT, mais une liste d’actions de prévention des risques et de protection des salariés, consignée dans le document unique lui-même.</w:t>
+      </w:r>
+    </w:p>
+    <w:p>
+      <w:pPr>
+        <w:spacing w:before="0" w:after="100"/>
+      </w:pPr>
+      <w:r>
+        <w:rPr>
+          <w:b/>
+          <w:i w:val="0"/>
+          <w:sz w:val="21"/>
+        </w:rPr>
+        <w:t>L’erreur courante consiste à remplir la colonne « mesures décidées » du document unique et à considérer que le programme annuel est fait. Ce n’est pas la même pièce, et l’absence du programme se constate seule. Nos deux dernières colonnes de la fiche ci-dessus — indicateur de résultat et coût estimé — sont là pour que le passage de l’un à l’autre soit mécanique.</w:t>
+      </w:r>
+    </w:p>
+    <w:p>
+      <w:pPr>
+        <w:spacing w:before="280" w:after="80"/>
+      </w:pPr>
+      <w:r>
+        <w:rPr>
+          <w:b/>
+          <w:i w:val="0"/>
+          <w:color w:val="1F3B57"/>
+          <w:sz w:val="25"/>
+        </w:rPr>
+        <w:t>7. Quand le mettre à jour</w:t>
       </w:r>
     </w:p>
     <w:p>
@@ -3123,7 +3189,7 @@
           <w:color w:val="A0842E"/>
           <w:sz w:val="20"/>
         </w:rPr>
-        <w:t>Articles L.1152-4, L.1153-5 et D.1151-1</w:t>
+        <w:t>Articles L.1152-4, L.1153-5, D.1151-1 — et article D.4711-1</w:t>
       </w:r>
     </w:p>
     <w:p>
@@ -3290,6 +3356,59 @@
           <w:sz w:val="21"/>
         </w:rPr>
         <w:t>Un affichage qui renvoie à des fonctions sans nommer personne n’oriente personne. C’est le défaut le plus fréquent, et il vide l’action de son effet.</w:t>
+      </w:r>
+    </w:p>
+    <w:p>
+      <w:pPr>
+        <w:spacing w:before="240" w:after="80"/>
+      </w:pPr>
+      <w:r>
+        <w:rPr>
+          <w:b/>
+          <w:i w:val="0"/>
+          <w:color w:val="1F3B57"/>
+          <w:sz w:val="25"/>
+        </w:rPr>
+        <w:t>Le second affichage, qu’on oublie : l’article D.4711-1</w:t>
+      </w:r>
+    </w:p>
+    <w:p>
+      <w:pPr>
+        <w:spacing w:before="0" w:after="100"/>
+      </w:pPr>
+      <w:r>
+        <w:rPr>
+          <w:b w:val="0"/>
+          <w:i w:val="0"/>
+          <w:sz w:val="21"/>
+        </w:rPr>
+        <w:t>Indépendamment du harcèlement, l’employeur affiche dans des locaux normalement accessibles aux travailleurs l’adresse et le numéro d’appel : du médecin du travail ou du service de prévention et de santé au travail compétent pour l’établissement ; des services de secours d’urgence ; et de l’inspection du travail compétente, ainsi que le nom de l’inspecteur compétent.</w:t>
+      </w:r>
+    </w:p>
+    <w:p>
+      <w:pPr>
+        <w:spacing w:before="0" w:after="100"/>
+      </w:pPr>
+      <w:r>
+        <w:rPr>
+          <w:b w:val="0"/>
+          <w:i w:val="0"/>
+          <w:sz w:val="21"/>
+        </w:rPr>
+        <w:t>Cette obligation s’applique dès le premier salarié, sans seuil. Elle recoupe pour partie la liste de l’article D.1151-1 — médecin du travail, inspection du travail — et y ajoute les services de secours d’urgence, qui ne figurent pas dans la liste « harcèlement ».</w:t>
+      </w:r>
+    </w:p>
+    <w:p>
+      <w:pPr>
+        <w:spacing w:before="0" w:after="100"/>
+      </w:pPr>
+      <w:r>
+        <w:rPr>
+          <w:b/>
+          <w:i w:val="0"/>
+          <w:sz w:val="21"/>
+        </w:rPr>
+        <w:t>En pratique, deux affiches ou une seule ? Une seule est possible et préférable, à condition qu’elle porte tout : les deux textes du code pénal, les voies de recours, les cinq contacts de D.1151-1 et les services de secours d’urgence. Mais alors elle doit être complète — une affiche unique amputée fait manquer deux obligations au lieu d’une.</w:t>
       </w:r>
     </w:p>
     <w:p>
@@ -3551,6 +3670,36 @@
                 <w:b/>
                 <w:sz w:val="18"/>
               </w:rPr>
+              <w:t>Services de secours d’urgence</w:t>
+            </w:r>
+          </w:p>
+        </w:tc>
+        <w:tc>
+          <w:tcPr>
+            <w:tcW w:type="dxa" w:w="4873"/>
+          </w:tcPr>
+          <w:p>
+            <w:r>
+              <w:rPr>
+                <w:b w:val="0"/>
+                <w:sz w:val="18"/>
+              </w:rPr>
+              <w:t>SAMU 15 — Pompiers 18 — Police-secours 17 — Numéro d’urgence européen 112. Plus, le cas échéant, le numéro interne des secouristes du travail de l’établissement. Exigé par l’article D.4711-1, dès le premier salarié.</w:t>
+            </w:r>
+          </w:p>
+        </w:tc>
+      </w:tr>
+      <w:tr>
+        <w:tc>
+          <w:tcPr>
+            <w:tcW w:type="dxa" w:w="4873"/>
+          </w:tcPr>
+          <w:p>
+            <w:r>
+              <w:rPr>
+                <w:b/>
+                <w:sz w:val="18"/>
+              </w:rPr>
               <w:t>Référent du comité</w:t>
             </w:r>
           </w:p>
@@ -3846,6 +3995,18 @@
           <w:sz w:val="20"/>
         </w:rPr>
         <w:t>Aucune photographie, aucune date : rien à produire au dossier.</w:t>
+      </w:r>
+    </w:p>
+    <w:p>
+      <w:pPr>
+        <w:pStyle w:val="ListBullet"/>
+        <w:spacing w:after="40"/>
+      </w:pPr>
+      <w:r>
+        <w:rPr>
+          <w:sz w:val="20"/>
+        </w:rPr>
+        <w:t>Les coordonnées des services de secours d’urgence oubliées : c’est l’article D.4711-1 qui est alors manqué, et il se constate à l’œil nu.</w:t>
       </w:r>
     </w:p>
     <w:p>

</xml_diff>